<commit_message>
Bloc 6 : scénarios défavorables de référence par secteur et calcul du choc
Bibliothèque de scénarios (hypothèses sur recettes et charges, avec leur
source) proposée selon le secteur du projet ; aide au calcul du choc sur
les CFADS à partir d'une année type, reportable dans la saisie. Valeurs
candidates à valider par le comité. Note pédagogique mise à jour.

Co-Authored-By: Claude Opus 5.5 <noreply@anthropic.com>
Claude-Session: https://claude.ai/code/session_019wSxNNAdZ9X5Q51BQYkAf8
</commit_message>
<xml_diff>
--- a/docs/formation/Stress_tests_modele_PF.docx
+++ b/docs/formation/Stress_tests_modele_PF.docx
@@ -35,7 +35,7 @@
           <w:iCs/>
           <w:color w:val="7A7A7A"/>
         </w:rPr>
-        <w:t xml:space="preserve">Note pédagogique : à quoi sert le scénario défavorable, comment le modèle le calcule et comment lire le résultat.</w:t>
+        <w:t xml:space="preserve">Note pédagogique : à quoi sert le scénario défavorable, d’où viennent ses hypothèses, comment le modèle le calcule et comment lire le résultat.</w:t>
       </w:r>
     </w:p>
     <w:p>
@@ -196,7 +196,7 @@
         <w:t xml:space="preserve">Définir le scénario défavorable. </w:t>
       </w:r>
       <w:r>
-        <w:t xml:space="preserve">L’analyste choisit un scénario centré sur le risque principal du projet (moins de production, moins de trafic, coûts plus élevés…) et le décrit en une phrase dans la saisie (bloc 6).</w:t>
+        <w:t xml:space="preserve">L’analyste part du scénario de référence du secteur proposé par l’outil (voir section 7), l’adapte au projet et le décrit en une phrase dans la saisie (bloc 6).</w:t>
       </w:r>
     </w:p>
     <w:p>
@@ -216,7 +216,7 @@
         <w:t xml:space="preserve">Le traduire en baisse de CFADS. </w:t>
       </w:r>
       <w:r>
-        <w:t xml:space="preserve">Deux façons de faire : soit un pourcentage unique de baisse du CFADS (le « choc », par exemple 13,8 %) appliqué à toutes les échéances, soit un CFADS stressé saisi échéance par échéance, issu du modèle financier du projet. Si un CFADS stressé est saisi pour une échéance, il remplace le choc sur cette échéance.</w:t>
+        <w:t xml:space="preserve">Deux façons de faire : soit un pourcentage unique de baisse du CFADS (le « choc », par exemple 14 %) appliqué à toutes les échéances, calculé comme en section 4 ; soit un CFADS stressé saisi échéance par échéance, issu du modèle financier du projet. Si un CFADS stressé est saisi pour une échéance, il remplace le choc sur cette échéance.</w:t>
       </w:r>
     </w:p>
     <w:p>
@@ -336,7 +336,7 @@
         <w:pStyle w:val="Heading1"/>
       </w:pPr>
       <w:r>
-        <w:t xml:space="preserve">4. Un exemple chiffré pas à pas : la centrale solaire</w:t>
+        <w:t xml:space="preserve">4. Du scénario au choc : le calcul</w:t>
       </w:r>
     </w:p>
     <w:p>
@@ -344,39 +344,7 @@
         <w:spacing w:after="140" w:line="300"/>
       </w:pPr>
       <w:r>
-        <w:t xml:space="preserve">Cas 1 de la base de test (fictif) : centrale photovoltaïque de 80 MWc en construction, production vendue sous contrat d’achat de 25 ans (régime R1, take-or-pay), secteur ENR.</w:t>
-      </w:r>
-    </w:p>
-    <w:p>
-      <w:pPr>
-        <w:pStyle w:val="Heading2"/>
-      </w:pPr>
-      <w:r>
-        <w:t xml:space="preserve">Étape 1 · Le scénario</w:t>
-      </w:r>
-    </w:p>
-    <w:p>
-      <w:pPr>
-        <w:spacing w:after="140" w:line="300"/>
-      </w:pPr>
-      <w:r>
-        <w:t xml:space="preserve">Le risque principal d’une centrale solaire est l’ensoleillement. On retient une production au niveau P90, c’est-à-dire celle qui a 90 % de chances d’être dépassée, soit 8 % de moins que la production attendue (P50), et des charges d’exploitation en hausse de 10 %.</w:t>
-      </w:r>
-    </w:p>
-    <w:p>
-      <w:pPr>
-        <w:pStyle w:val="Heading2"/>
-      </w:pPr>
-      <w:r>
-        <w:t xml:space="preserve">Étape 2 · Pourquoi la baisse du CFADS est plus forte que celle des recettes</w:t>
-      </w:r>
-    </w:p>
-    <w:p>
-      <w:pPr>
-        <w:spacing w:after="140" w:line="300"/>
-      </w:pPr>
-      <w:r>
-        <w:t xml:space="preserve">Les charges ne baissent pas quand les recettes baissent : la perte de recettes et la hausse des charges se reportent toutes les deux sur le CFADS, qui est plus petit que le chiffre d’affaires. D’où un effet de levier. Illustration en ordre de grandeur :</w:t>
+        <w:t xml:space="preserve">Le scénario s’exprime en langage métier (« production − 8 % », « charges + 10 % ») ; le DSCR se calcule en dirhams. Le choc ne se choisit pas : il se calcule en refaisant le compte d’une année type avec les hypothèses défavorables.</w:t>
       </w:r>
     </w:p>
     <w:tbl>
@@ -392,10 +360,10 @@
         </w:tblBorders>
       </w:tblPr>
       <w:tblGrid>
-        <w:gridCol w:w="3246"/>
-        <w:gridCol w:w="2164"/>
-        <w:gridCol w:w="2164"/>
-        <w:gridCol w:w="1732"/>
+        <w:gridCol w:w="2659"/>
+        <w:gridCol w:w="1773"/>
+        <w:gridCol w:w="2659"/>
+        <w:gridCol w:w="2215"/>
       </w:tblGrid>
       <w:tr>
         <w:trPr>
@@ -403,7 +371,7 @@
         </w:trPr>
         <w:tc>
           <w:tcPr>
-            <w:tcW w:type="dxa" w:w="3246"/>
+            <w:tcW w:type="dxa" w:w="2659"/>
             <w:tcBorders>
               <w:top w:val="single" w:color="D9D9D9" w:sz="4"/>
               <w:left w:val="single" w:color="D9D9D9" w:sz="4"/>
@@ -430,13 +398,13 @@
                 <w:sz w:val="20"/>
                 <w:szCs w:val="20"/>
               </w:rPr>
-              <w:t xml:space="preserve"/>
-            </w:r>
-          </w:p>
-        </w:tc>
-        <w:tc>
-          <w:tcPr>
-            <w:tcW w:type="dxa" w:w="2164"/>
+              <w:t xml:space="preserve">En MMAD</w:t>
+            </w:r>
+          </w:p>
+        </w:tc>
+        <w:tc>
+          <w:tcPr>
+            <w:tcW w:type="dxa" w:w="1773"/>
             <w:tcBorders>
               <w:top w:val="single" w:color="D9D9D9" w:sz="4"/>
               <w:left w:val="single" w:color="D9D9D9" w:sz="4"/>
@@ -469,7 +437,7 @@
         </w:tc>
         <w:tc>
           <w:tcPr>
-            <w:tcW w:type="dxa" w:w="2164"/>
+            <w:tcW w:type="dxa" w:w="2659"/>
             <w:tcBorders>
               <w:top w:val="single" w:color="D9D9D9" w:sz="4"/>
               <w:left w:val="single" w:color="D9D9D9" w:sz="4"/>
@@ -486,7 +454,7 @@
           </w:tcPr>
           <w:p>
             <w:pPr>
-              <w:jc w:val="right"/>
+              <w:jc w:val="left"/>
             </w:pPr>
             <w:r>
               <w:rPr>
@@ -496,13 +464,13 @@
                 <w:sz w:val="20"/>
                 <w:szCs w:val="20"/>
               </w:rPr>
-              <w:t xml:space="preserve">Scénario défavorable</w:t>
-            </w:r>
-          </w:p>
-        </w:tc>
-        <w:tc>
-          <w:tcPr>
-            <w:tcW w:type="dxa" w:w="1732"/>
+              <w:t xml:space="preserve">Hypothèse</w:t>
+            </w:r>
+          </w:p>
+        </w:tc>
+        <w:tc>
+          <w:tcPr>
+            <w:tcW w:type="dxa" w:w="2215"/>
             <w:tcBorders>
               <w:top w:val="single" w:color="D9D9D9" w:sz="4"/>
               <w:left w:val="single" w:color="D9D9D9" w:sz="4"/>
@@ -529,15 +497,18 @@
                 <w:sz w:val="20"/>
                 <w:szCs w:val="20"/>
               </w:rPr>
-              <w:t xml:space="preserve">Variation</w:t>
+              <w:t xml:space="preserve">Scénario défavorable</w:t>
             </w:r>
           </w:p>
         </w:tc>
       </w:tr>
       <w:tr>
-        <w:tc>
-          <w:tcPr>
-            <w:tcW w:type="dxa" w:w="3246"/>
+        <w:trPr>
+          <w:cantSplit/>
+        </w:trPr>
+        <w:tc>
+          <w:tcPr>
+            <w:tcW w:type="dxa" w:w="2659"/>
             <w:tcBorders>
               <w:top w:val="single" w:color="D9D9D9" w:sz="4"/>
               <w:left w:val="single" w:color="D9D9D9" w:sz="4"/>
@@ -570,7 +541,7 @@
         </w:tc>
         <w:tc>
           <w:tcPr>
-            <w:tcW w:type="dxa" w:w="2164"/>
+            <w:tcW w:type="dxa" w:w="1773"/>
             <w:tcBorders>
               <w:top w:val="single" w:color="D9D9D9" w:sz="4"/>
               <w:left w:val="single" w:color="D9D9D9" w:sz="4"/>
@@ -597,13 +568,46 @@
                 <w:sz w:val="20"/>
                 <w:szCs w:val="20"/>
               </w:rPr>
-              <w:t xml:space="preserve">100,0</w:t>
-            </w:r>
-          </w:p>
-        </w:tc>
-        <w:tc>
-          <w:tcPr>
-            <w:tcW w:type="dxa" w:w="2164"/>
+              <w:t xml:space="preserve">100</w:t>
+            </w:r>
+          </w:p>
+        </w:tc>
+        <w:tc>
+          <w:tcPr>
+            <w:tcW w:type="dxa" w:w="2659"/>
+            <w:tcBorders>
+              <w:top w:val="single" w:color="D9D9D9" w:sz="4"/>
+              <w:left w:val="single" w:color="D9D9D9" w:sz="4"/>
+              <w:bottom w:val="single" w:color="D9D9D9" w:sz="4"/>
+              <w:right w:val="single" w:color="D9D9D9" w:sz="4"/>
+            </w:tcBorders>
+            <w:shd w:fill="FFFFFF" w:color="auto" w:val="clear"/>
+            <w:tcMar>
+              <w:top w:type="dxa" w:w="60"/>
+              <w:left w:type="dxa" w:w="100"/>
+              <w:bottom w:type="dxa" w:w="60"/>
+              <w:right w:type="dxa" w:w="100"/>
+            </w:tcMar>
+          </w:tcPr>
+          <w:p>
+            <w:pPr>
+              <w:jc w:val="left"/>
+            </w:pPr>
+            <w:r>
+              <w:rPr>
+                <w:b w:val="false"/>
+                <w:bCs w:val="false"/>
+                <w:color w:val="333333"/>
+                <w:sz w:val="20"/>
+                <w:szCs w:val="20"/>
+              </w:rPr>
+              <w:t xml:space="preserve">− 8 % (production P90)</w:t>
+            </w:r>
+          </w:p>
+        </w:tc>
+        <w:tc>
+          <w:tcPr>
+            <w:tcW w:type="dxa" w:w="2215"/>
             <w:tcBorders>
               <w:top w:val="single" w:color="D9D9D9" w:sz="4"/>
               <w:left w:val="single" w:color="D9D9D9" w:sz="4"/>
@@ -630,48 +634,18 @@
                 <w:sz w:val="20"/>
                 <w:szCs w:val="20"/>
               </w:rPr>
-              <w:t xml:space="preserve">92,0</w:t>
-            </w:r>
-          </w:p>
-        </w:tc>
-        <w:tc>
-          <w:tcPr>
-            <w:tcW w:type="dxa" w:w="1732"/>
-            <w:tcBorders>
-              <w:top w:val="single" w:color="D9D9D9" w:sz="4"/>
-              <w:left w:val="single" w:color="D9D9D9" w:sz="4"/>
-              <w:bottom w:val="single" w:color="D9D9D9" w:sz="4"/>
-              <w:right w:val="single" w:color="D9D9D9" w:sz="4"/>
-            </w:tcBorders>
-            <w:shd w:fill="FFFFFF" w:color="auto" w:val="clear"/>
-            <w:tcMar>
-              <w:top w:type="dxa" w:w="60"/>
-              <w:left w:type="dxa" w:w="100"/>
-              <w:bottom w:type="dxa" w:w="60"/>
-              <w:right w:type="dxa" w:w="100"/>
-            </w:tcMar>
-          </w:tcPr>
-          <w:p>
-            <w:pPr>
-              <w:jc w:val="right"/>
-            </w:pPr>
-            <w:r>
-              <w:rPr>
-                <w:b w:val="false"/>
-                <w:bCs w:val="false"/>
-                <w:color w:val="333333"/>
-                <w:sz w:val="20"/>
-                <w:szCs w:val="20"/>
-              </w:rPr>
-              <w:t xml:space="preserve">− 8 %</w:t>
+              <w:t xml:space="preserve">92</w:t>
             </w:r>
           </w:p>
         </w:tc>
       </w:tr>
       <w:tr>
-        <w:tc>
-          <w:tcPr>
-            <w:tcW w:type="dxa" w:w="3246"/>
+        <w:trPr>
+          <w:cantSplit/>
+        </w:trPr>
+        <w:tc>
+          <w:tcPr>
+            <w:tcW w:type="dxa" w:w="2659"/>
             <w:tcBorders>
               <w:top w:val="single" w:color="D9D9D9" w:sz="4"/>
               <w:left w:val="single" w:color="D9D9D9" w:sz="4"/>
@@ -704,7 +678,7 @@
         </w:tc>
         <w:tc>
           <w:tcPr>
-            <w:tcW w:type="dxa" w:w="2164"/>
+            <w:tcW w:type="dxa" w:w="1773"/>
             <w:tcBorders>
               <w:top w:val="single" w:color="D9D9D9" w:sz="4"/>
               <w:left w:val="single" w:color="D9D9D9" w:sz="4"/>
@@ -731,13 +705,46 @@
                 <w:sz w:val="20"/>
                 <w:szCs w:val="20"/>
               </w:rPr>
-              <w:t xml:space="preserve">24,3</w:t>
-            </w:r>
-          </w:p>
-        </w:tc>
-        <w:tc>
-          <w:tcPr>
-            <w:tcW w:type="dxa" w:w="2164"/>
+              <w:t xml:space="preserve">− 25</w:t>
+            </w:r>
+          </w:p>
+        </w:tc>
+        <w:tc>
+          <w:tcPr>
+            <w:tcW w:type="dxa" w:w="2659"/>
+            <w:tcBorders>
+              <w:top w:val="single" w:color="D9D9D9" w:sz="4"/>
+              <w:left w:val="single" w:color="D9D9D9" w:sz="4"/>
+              <w:bottom w:val="single" w:color="D9D9D9" w:sz="4"/>
+              <w:right w:val="single" w:color="D9D9D9" w:sz="4"/>
+            </w:tcBorders>
+            <w:shd w:fill="FFFFFF" w:color="auto" w:val="clear"/>
+            <w:tcMar>
+              <w:top w:type="dxa" w:w="60"/>
+              <w:left w:type="dxa" w:w="100"/>
+              <w:bottom w:type="dxa" w:w="60"/>
+              <w:right w:type="dxa" w:w="100"/>
+            </w:tcMar>
+          </w:tcPr>
+          <w:p>
+            <w:pPr>
+              <w:jc w:val="left"/>
+            </w:pPr>
+            <w:r>
+              <w:rPr>
+                <w:b w:val="false"/>
+                <w:bCs w:val="false"/>
+                <w:color w:val="333333"/>
+                <w:sz w:val="20"/>
+                <w:szCs w:val="20"/>
+              </w:rPr>
+              <w:t xml:space="preserve">+ 10 %</w:t>
+            </w:r>
+          </w:p>
+        </w:tc>
+        <w:tc>
+          <w:tcPr>
+            <w:tcW w:type="dxa" w:w="2215"/>
             <w:tcBorders>
               <w:top w:val="single" w:color="D9D9D9" w:sz="4"/>
               <w:left w:val="single" w:color="D9D9D9" w:sz="4"/>
@@ -764,48 +771,18 @@
                 <w:sz w:val="20"/>
                 <w:szCs w:val="20"/>
               </w:rPr>
-              <w:t xml:space="preserve">26,7</w:t>
-            </w:r>
-          </w:p>
-        </w:tc>
-        <w:tc>
-          <w:tcPr>
-            <w:tcW w:type="dxa" w:w="1732"/>
-            <w:tcBorders>
-              <w:top w:val="single" w:color="D9D9D9" w:sz="4"/>
-              <w:left w:val="single" w:color="D9D9D9" w:sz="4"/>
-              <w:bottom w:val="single" w:color="D9D9D9" w:sz="4"/>
-              <w:right w:val="single" w:color="D9D9D9" w:sz="4"/>
-            </w:tcBorders>
-            <w:shd w:fill="FFFFFF" w:color="auto" w:val="clear"/>
-            <w:tcMar>
-              <w:top w:type="dxa" w:w="60"/>
-              <w:left w:type="dxa" w:w="100"/>
-              <w:bottom w:type="dxa" w:w="60"/>
-              <w:right w:type="dxa" w:w="100"/>
-            </w:tcMar>
-          </w:tcPr>
-          <w:p>
-            <w:pPr>
-              <w:jc w:val="right"/>
-            </w:pPr>
-            <w:r>
-              <w:rPr>
-                <w:b w:val="false"/>
-                <w:bCs w:val="false"/>
-                <w:color w:val="333333"/>
-                <w:sz w:val="20"/>
-                <w:szCs w:val="20"/>
-              </w:rPr>
-              <w:t xml:space="preserve">+ 10 %</w:t>
+              <w:t xml:space="preserve">− 27,5</w:t>
             </w:r>
           </w:p>
         </w:tc>
       </w:tr>
       <w:tr>
-        <w:tc>
-          <w:tcPr>
-            <w:tcW w:type="dxa" w:w="3246"/>
+        <w:trPr>
+          <w:cantSplit/>
+        </w:trPr>
+        <w:tc>
+          <w:tcPr>
+            <w:tcW w:type="dxa" w:w="2659"/>
             <w:tcBorders>
               <w:top w:val="single" w:color="D9D9D9" w:sz="4"/>
               <w:left w:val="single" w:color="D9D9D9" w:sz="4"/>
@@ -838,7 +815,7 @@
         </w:tc>
         <w:tc>
           <w:tcPr>
-            <w:tcW w:type="dxa" w:w="2164"/>
+            <w:tcW w:type="dxa" w:w="1773"/>
             <w:tcBorders>
               <w:top w:val="single" w:color="D9D9D9" w:sz="4"/>
               <w:left w:val="single" w:color="D9D9D9" w:sz="4"/>
@@ -865,13 +842,46 @@
                 <w:sz w:val="20"/>
                 <w:szCs w:val="20"/>
               </w:rPr>
-              <w:t xml:space="preserve">75,7</w:t>
-            </w:r>
-          </w:p>
-        </w:tc>
-        <w:tc>
-          <w:tcPr>
-            <w:tcW w:type="dxa" w:w="2164"/>
+              <w:t xml:space="preserve">75</w:t>
+            </w:r>
+          </w:p>
+        </w:tc>
+        <w:tc>
+          <w:tcPr>
+            <w:tcW w:type="dxa" w:w="2659"/>
+            <w:tcBorders>
+              <w:top w:val="single" w:color="D9D9D9" w:sz="4"/>
+              <w:left w:val="single" w:color="D9D9D9" w:sz="4"/>
+              <w:bottom w:val="single" w:color="D9D9D9" w:sz="4"/>
+              <w:right w:val="single" w:color="D9D9D9" w:sz="4"/>
+            </w:tcBorders>
+            <w:shd w:fill="FFFFFF" w:color="auto" w:val="clear"/>
+            <w:tcMar>
+              <w:top w:type="dxa" w:w="60"/>
+              <w:left w:type="dxa" w:w="100"/>
+              <w:bottom w:type="dxa" w:w="60"/>
+              <w:right w:type="dxa" w:w="100"/>
+            </w:tcMar>
+          </w:tcPr>
+          <w:p>
+            <w:pPr>
+              <w:jc w:val="left"/>
+            </w:pPr>
+            <w:r>
+              <w:rPr>
+                <w:b w:val="false"/>
+                <w:bCs w:val="false"/>
+                <w:color w:val="333333"/>
+                <w:sz w:val="20"/>
+                <w:szCs w:val="20"/>
+              </w:rPr>
+              <w:t xml:space="preserve"/>
+            </w:r>
+          </w:p>
+        </w:tc>
+        <w:tc>
+          <w:tcPr>
+            <w:tcW w:type="dxa" w:w="2215"/>
             <w:tcBorders>
               <w:top w:val="single" w:color="D9D9D9" w:sz="4"/>
               <w:left w:val="single" w:color="D9D9D9" w:sz="4"/>
@@ -898,13 +908,51 @@
                 <w:sz w:val="20"/>
                 <w:szCs w:val="20"/>
               </w:rPr>
-              <w:t xml:space="preserve">65,3</w:t>
-            </w:r>
-          </w:p>
-        </w:tc>
-        <w:tc>
-          <w:tcPr>
-            <w:tcW w:type="dxa" w:w="1732"/>
+              <w:t xml:space="preserve">64,5</w:t>
+            </w:r>
+          </w:p>
+        </w:tc>
+      </w:tr>
+      <w:tr>
+        <w:trPr>
+          <w:cantSplit/>
+        </w:trPr>
+        <w:tc>
+          <w:tcPr>
+            <w:tcW w:type="dxa" w:w="2659"/>
+            <w:tcBorders>
+              <w:top w:val="single" w:color="D9D9D9" w:sz="4"/>
+              <w:left w:val="single" w:color="D9D9D9" w:sz="4"/>
+              <w:bottom w:val="single" w:color="D9D9D9" w:sz="4"/>
+              <w:right w:val="single" w:color="D9D9D9" w:sz="4"/>
+            </w:tcBorders>
+            <w:shd w:fill="FFFFFF" w:color="auto" w:val="clear"/>
+            <w:tcMar>
+              <w:top w:type="dxa" w:w="60"/>
+              <w:left w:type="dxa" w:w="100"/>
+              <w:bottom w:type="dxa" w:w="60"/>
+              <w:right w:type="dxa" w:w="100"/>
+            </w:tcMar>
+          </w:tcPr>
+          <w:p>
+            <w:pPr>
+              <w:jc w:val="left"/>
+            </w:pPr>
+            <w:r>
+              <w:rPr>
+                <w:b/>
+                <w:bCs/>
+                <w:color w:val="333333"/>
+                <w:sz w:val="20"/>
+                <w:szCs w:val="20"/>
+              </w:rPr>
+              <w:t xml:space="preserve">Service de la dette</w:t>
+            </w:r>
+          </w:p>
+        </w:tc>
+        <w:tc>
+          <w:tcPr>
+            <w:tcW w:type="dxa" w:w="1773"/>
             <w:tcBorders>
               <w:top w:val="single" w:color="D9D9D9" w:sz="4"/>
               <w:left w:val="single" w:color="D9D9D9" w:sz="4"/>
@@ -931,7 +979,210 @@
                 <w:sz w:val="20"/>
                 <w:szCs w:val="20"/>
               </w:rPr>
-              <w:t xml:space="preserve">− 13,8 %</w:t>
+              <w:t xml:space="preserve">58</w:t>
+            </w:r>
+          </w:p>
+        </w:tc>
+        <w:tc>
+          <w:tcPr>
+            <w:tcW w:type="dxa" w:w="2659"/>
+            <w:tcBorders>
+              <w:top w:val="single" w:color="D9D9D9" w:sz="4"/>
+              <w:left w:val="single" w:color="D9D9D9" w:sz="4"/>
+              <w:bottom w:val="single" w:color="D9D9D9" w:sz="4"/>
+              <w:right w:val="single" w:color="D9D9D9" w:sz="4"/>
+            </w:tcBorders>
+            <w:shd w:fill="FFFFFF" w:color="auto" w:val="clear"/>
+            <w:tcMar>
+              <w:top w:type="dxa" w:w="60"/>
+              <w:left w:type="dxa" w:w="100"/>
+              <w:bottom w:type="dxa" w:w="60"/>
+              <w:right w:type="dxa" w:w="100"/>
+            </w:tcMar>
+          </w:tcPr>
+          <w:p>
+            <w:pPr>
+              <w:jc w:val="left"/>
+            </w:pPr>
+            <w:r>
+              <w:rPr>
+                <w:b w:val="false"/>
+                <w:bCs w:val="false"/>
+                <w:color w:val="333333"/>
+                <w:sz w:val="20"/>
+                <w:szCs w:val="20"/>
+              </w:rPr>
+              <w:t xml:space="preserve">inchangé</w:t>
+            </w:r>
+          </w:p>
+        </w:tc>
+        <w:tc>
+          <w:tcPr>
+            <w:tcW w:type="dxa" w:w="2215"/>
+            <w:tcBorders>
+              <w:top w:val="single" w:color="D9D9D9" w:sz="4"/>
+              <w:left w:val="single" w:color="D9D9D9" w:sz="4"/>
+              <w:bottom w:val="single" w:color="D9D9D9" w:sz="4"/>
+              <w:right w:val="single" w:color="D9D9D9" w:sz="4"/>
+            </w:tcBorders>
+            <w:shd w:fill="FFFFFF" w:color="auto" w:val="clear"/>
+            <w:tcMar>
+              <w:top w:type="dxa" w:w="60"/>
+              <w:left w:type="dxa" w:w="100"/>
+              <w:bottom w:type="dxa" w:w="60"/>
+              <w:right w:type="dxa" w:w="100"/>
+            </w:tcMar>
+          </w:tcPr>
+          <w:p>
+            <w:pPr>
+              <w:jc w:val="right"/>
+            </w:pPr>
+            <w:r>
+              <w:rPr>
+                <w:b w:val="false"/>
+                <w:bCs w:val="false"/>
+                <w:color w:val="333333"/>
+                <w:sz w:val="20"/>
+                <w:szCs w:val="20"/>
+              </w:rPr>
+              <w:t xml:space="preserve">58</w:t>
+            </w:r>
+          </w:p>
+        </w:tc>
+      </w:tr>
+      <w:tr>
+        <w:trPr>
+          <w:cantSplit/>
+        </w:trPr>
+        <w:tc>
+          <w:tcPr>
+            <w:tcW w:type="dxa" w:w="2659"/>
+            <w:tcBorders>
+              <w:top w:val="single" w:color="D9D9D9" w:sz="4"/>
+              <w:left w:val="single" w:color="D9D9D9" w:sz="4"/>
+              <w:bottom w:val="single" w:color="D9D9D9" w:sz="4"/>
+              <w:right w:val="single" w:color="D9D9D9" w:sz="4"/>
+            </w:tcBorders>
+            <w:shd w:fill="FFFFFF" w:color="auto" w:val="clear"/>
+            <w:tcMar>
+              <w:top w:type="dxa" w:w="60"/>
+              <w:left w:type="dxa" w:w="100"/>
+              <w:bottom w:type="dxa" w:w="60"/>
+              <w:right w:type="dxa" w:w="100"/>
+            </w:tcMar>
+          </w:tcPr>
+          <w:p>
+            <w:pPr>
+              <w:jc w:val="left"/>
+            </w:pPr>
+            <w:r>
+              <w:rPr>
+                <w:b/>
+                <w:bCs/>
+                <w:color w:val="333333"/>
+                <w:sz w:val="20"/>
+                <w:szCs w:val="20"/>
+              </w:rPr>
+              <w:t xml:space="preserve">DSCR</w:t>
+            </w:r>
+          </w:p>
+        </w:tc>
+        <w:tc>
+          <w:tcPr>
+            <w:tcW w:type="dxa" w:w="1773"/>
+            <w:tcBorders>
+              <w:top w:val="single" w:color="D9D9D9" w:sz="4"/>
+              <w:left w:val="single" w:color="D9D9D9" w:sz="4"/>
+              <w:bottom w:val="single" w:color="D9D9D9" w:sz="4"/>
+              <w:right w:val="single" w:color="D9D9D9" w:sz="4"/>
+            </w:tcBorders>
+            <w:shd w:fill="FFFFFF" w:color="auto" w:val="clear"/>
+            <w:tcMar>
+              <w:top w:type="dxa" w:w="60"/>
+              <w:left w:type="dxa" w:w="100"/>
+              <w:bottom w:type="dxa" w:w="60"/>
+              <w:right w:type="dxa" w:w="100"/>
+            </w:tcMar>
+          </w:tcPr>
+          <w:p>
+            <w:pPr>
+              <w:jc w:val="right"/>
+            </w:pPr>
+            <w:r>
+              <w:rPr>
+                <w:b w:val="false"/>
+                <w:bCs w:val="false"/>
+                <w:color w:val="333333"/>
+                <w:sz w:val="20"/>
+                <w:szCs w:val="20"/>
+              </w:rPr>
+              <w:t xml:space="preserve">1,29</w:t>
+            </w:r>
+          </w:p>
+        </w:tc>
+        <w:tc>
+          <w:tcPr>
+            <w:tcW w:type="dxa" w:w="2659"/>
+            <w:tcBorders>
+              <w:top w:val="single" w:color="D9D9D9" w:sz="4"/>
+              <w:left w:val="single" w:color="D9D9D9" w:sz="4"/>
+              <w:bottom w:val="single" w:color="D9D9D9" w:sz="4"/>
+              <w:right w:val="single" w:color="D9D9D9" w:sz="4"/>
+            </w:tcBorders>
+            <w:shd w:fill="FFFFFF" w:color="auto" w:val="clear"/>
+            <w:tcMar>
+              <w:top w:type="dxa" w:w="60"/>
+              <w:left w:type="dxa" w:w="100"/>
+              <w:bottom w:type="dxa" w:w="60"/>
+              <w:right w:type="dxa" w:w="100"/>
+            </w:tcMar>
+          </w:tcPr>
+          <w:p>
+            <w:pPr>
+              <w:jc w:val="left"/>
+            </w:pPr>
+            <w:r>
+              <w:rPr>
+                <w:b w:val="false"/>
+                <w:bCs w:val="false"/>
+                <w:color w:val="333333"/>
+                <w:sz w:val="20"/>
+                <w:szCs w:val="20"/>
+              </w:rPr>
+              <w:t xml:space="preserve"/>
+            </w:r>
+          </w:p>
+        </w:tc>
+        <w:tc>
+          <w:tcPr>
+            <w:tcW w:type="dxa" w:w="2215"/>
+            <w:tcBorders>
+              <w:top w:val="single" w:color="D9D9D9" w:sz="4"/>
+              <w:left w:val="single" w:color="D9D9D9" w:sz="4"/>
+              <w:bottom w:val="single" w:color="D9D9D9" w:sz="4"/>
+              <w:right w:val="single" w:color="D9D9D9" w:sz="4"/>
+            </w:tcBorders>
+            <w:shd w:fill="FFFFFF" w:color="auto" w:val="clear"/>
+            <w:tcMar>
+              <w:top w:type="dxa" w:w="60"/>
+              <w:left w:type="dxa" w:w="100"/>
+              <w:bottom w:type="dxa" w:w="60"/>
+              <w:right w:type="dxa" w:w="100"/>
+            </w:tcMar>
+          </w:tcPr>
+          <w:p>
+            <w:pPr>
+              <w:jc w:val="right"/>
+            </w:pPr>
+            <w:r>
+              <w:rPr>
+                <w:b w:val="false"/>
+                <w:bCs w:val="false"/>
+                <w:color w:val="333333"/>
+                <w:sz w:val="20"/>
+                <w:szCs w:val="20"/>
+              </w:rPr>
+              <w:t xml:space="preserve">1,11</w:t>
             </w:r>
           </w:p>
         </w:tc>
@@ -944,10 +1195,73 @@
     </w:p>
     <w:p>
       <w:pPr>
+        <w:pBdr>
+          <w:left w:val="single" w:color="E8790F" w:sz="18" w:space="8"/>
+        </w:pBdr>
+        <w:shd w:fill="FDEBD3" w:color="auto" w:val="clear"/>
+        <w:spacing w:after="200" w:before="120" w:line="300"/>
+        <w:ind w:left="160" w:right="160"/>
+      </w:pPr>
+      <w:r>
+        <w:rPr>
+          <w:b/>
+          <w:bCs/>
+          <w:color w:val="5A3A1E"/>
+        </w:rPr>
+        <w:t xml:space="preserve">Les deux formules</w:t>
+      </w:r>
+      <w:r>
+        <w:br/>
+        <w:t xml:space="preserve"/>
+      </w:r>
+      <w:r>
+        <w:t xml:space="preserve">Choc = (recettes perdues + charges supplémentaires) ÷ CFADS central = (8 + 2,5) ÷ 75 = 14 %</w:t>
+      </w:r>
+      <w:r>
+        <w:br/>
+        <w:t xml:space="preserve"/>
+      </w:r>
+      <w:r>
+        <w:t xml:space="preserve">DSCR stressé = DSCR central × (1 − choc) = 1,29 × 0,86 = 1,11</w:t>
+      </w:r>
+    </w:p>
+    <w:p>
+      <w:pPr>
         <w:spacing w:after="140" w:line="300"/>
       </w:pPr>
       <w:r>
-        <w:t xml:space="preserve">Une baisse de 8 % des recettes devient ainsi une baisse de 13,8 % du CFADS : c’est le choc saisi dans le modèle (0,138).</w:t>
+        <w:t xml:space="preserve">Le choc (14 %) est plus fort que la baisse des recettes (8 %) parce que les deux pertes sortent du CFADS, plus petit que les recettes : c’est l’effet des charges fixes. Et comme le service de la dette ne bouge pas, le DSCR baisse exactement du même pourcentage que le CFADS.</w:t>
+      </w:r>
+    </w:p>
+    <w:p>
+      <w:pPr>
+        <w:spacing w:after="140" w:line="300"/>
+      </w:pPr>
+      <w:r>
+        <w:rPr>
+          <w:b/>
+          <w:bCs/>
+        </w:rPr>
+        <w:t xml:space="preserve">Dans l’outil, </w:t>
+      </w:r>
+      <w:r>
+        <w:t xml:space="preserve">le bloc 6 propose ce calcul : on saisit les recettes et les charges d’une année type, les hypothèses de référence du secteur sont préremplies, et le bouton « Appliquer ce choc » reporte le résultat dans la saisie.</w:t>
+      </w:r>
+    </w:p>
+    <w:p>
+      <w:pPr>
+        <w:pStyle w:val="Heading1"/>
+      </w:pPr>
+      <w:r>
+        <w:t xml:space="preserve">5. Un exemple sur l’échéancier : la centrale solaire</w:t>
+      </w:r>
+    </w:p>
+    <w:p>
+      <w:pPr>
+        <w:spacing w:after="140" w:line="300"/>
+      </w:pPr>
+      <w:r>
+        <w:t xml:space="preserve">Cas 1 de la base de test (fictif) : centrale photovoltaïque de 80 MWc en construction, production vendue sous contrat d’achat de 25 ans (régime R1, take-or-pay), secteur ENR. Scénario : production P90 (− 8 %) et charges + 10 %. Avec la structure de charges de ce projet (environ 24 % des recettes), le choc calculé est de 13,8 %.</w:t>
       </w:r>
     </w:p>
     <w:p>
@@ -955,7 +1269,7 @@
         <w:pStyle w:val="Heading2"/>
       </w:pPr>
       <w:r>
-        <w:t xml:space="preserve">Étape 3 · Le DSCR stressé à chaque échéance</w:t>
+        <w:t xml:space="preserve">Le DSCR stressé à chaque échéance</w:t>
       </w:r>
     </w:p>
     <w:tbl>
@@ -1182,6 +1496,9 @@
         </w:tc>
       </w:tr>
       <w:tr>
+        <w:trPr>
+          <w:cantSplit/>
+        </w:trPr>
         <w:tc>
           <w:tcPr>
             <w:tcW w:type="dxa" w:w="1745"/>
@@ -1380,6 +1697,9 @@
         </w:tc>
       </w:tr>
       <w:tr>
+        <w:trPr>
+          <w:cantSplit/>
+        </w:trPr>
         <w:tc>
           <w:tcPr>
             <w:tcW w:type="dxa" w:w="1745"/>
@@ -1578,6 +1898,9 @@
         </w:tc>
       </w:tr>
       <w:tr>
+        <w:trPr>
+          <w:cantSplit/>
+        </w:trPr>
         <w:tc>
           <w:tcPr>
             <w:tcW w:type="dxa" w:w="1745"/>
@@ -1776,6 +2099,9 @@
         </w:tc>
       </w:tr>
       <w:tr>
+        <w:trPr>
+          <w:cantSplit/>
+        </w:trPr>
         <w:tc>
           <w:tcPr>
             <w:tcW w:type="dxa" w:w="1745"/>
@@ -1974,6 +2300,9 @@
         </w:tc>
       </w:tr>
       <w:tr>
+        <w:trPr>
+          <w:cantSplit/>
+        </w:trPr>
         <w:tc>
           <w:tcPr>
             <w:tcW w:type="dxa" w:w="1745"/>
@@ -2172,6 +2501,9 @@
         </w:tc>
       </w:tr>
       <w:tr>
+        <w:trPr>
+          <w:cantSplit/>
+        </w:trPr>
         <w:tc>
           <w:tcPr>
             <w:tcW w:type="dxa" w:w="1745"/>
@@ -2398,7 +2730,7 @@
         <w:pStyle w:val="Heading2"/>
       </w:pPr>
       <w:r>
-        <w:t xml:space="preserve">Étape 4 · Le classement</w:t>
+        <w:t xml:space="preserve">Le classement</w:t>
       </w:r>
     </w:p>
     <w:p>
@@ -2482,7 +2814,7 @@
         <w:pStyle w:val="Heading1"/>
       </w:pPr>
       <w:r>
-        <w:t xml:space="preserve">5. Trois situations types</w:t>
+        <w:t xml:space="preserve">6. Trois situations types</w:t>
       </w:r>
     </w:p>
     <w:p>
@@ -2717,6 +3049,9 @@
         </w:tc>
       </w:tr>
       <w:tr>
+        <w:trPr>
+          <w:cantSplit/>
+        </w:trPr>
         <w:tc>
           <w:tcPr>
             <w:tcW w:type="dxa" w:w="1683"/>
@@ -2917,6 +3252,9 @@
         </w:tc>
       </w:tr>
       <w:tr>
+        <w:trPr>
+          <w:cantSplit/>
+        </w:trPr>
         <w:tc>
           <w:tcPr>
             <w:tcW w:type="dxa" w:w="1683"/>
@@ -3117,6 +3455,9 @@
         </w:tc>
       </w:tr>
       <w:tr>
+        <w:trPr>
+          <w:cantSplit/>
+        </w:trPr>
         <w:tc>
           <w:tcPr>
             <w:tcW w:type="dxa" w:w="1683"/>
@@ -3335,7 +3676,7 @@
         <w:pStyle w:val="Heading1"/>
       </w:pPr>
       <w:r>
-        <w:t xml:space="preserve">6. Bien choisir le scénario défavorable</w:t>
+        <w:t xml:space="preserve">7. D’où viennent les hypothèses du scénario</w:t>
       </w:r>
     </w:p>
     <w:p>
@@ -3343,7 +3684,7 @@
         <w:spacing w:after="140" w:line="300"/>
       </w:pPr>
       <w:r>
-        <w:t xml:space="preserve">Le stress test ne vaut que par la qualité du scénario. Quelques principes :</w:t>
+        <w:t xml:space="preserve">Les hypothèses (« production − 8 % », « charges + 10 % ») ne sortent pas du modèle de scoring : l’analyste les fixe pour chaque projet, à partir de trois sources.</w:t>
       </w:r>
     </w:p>
     <w:p>
@@ -3351,19 +3692,19 @@
         <w:pStyle w:val="ListParagraph"/>
         <w:numPr>
           <w:ilvl w:val="0"/>
-          <w:numId w:val="2"/>
+          <w:numId w:val="4"/>
         </w:numPr>
-        <w:spacing w:after="70" w:line="290"/>
+        <w:spacing w:after="90" w:line="290"/>
       </w:pPr>
       <w:r>
         <w:rPr>
           <w:b/>
           <w:bCs/>
         </w:rPr>
-        <w:t xml:space="preserve">Viser le risque principal du projet, </w:t>
-      </w:r>
-      <w:r>
-        <w:t xml:space="preserve">celui qui fait vraiment varier les flux, plutôt qu’une baisse uniforme de tout.</w:t>
+        <w:t xml:space="preserve">Repérer les variables qui font bouger les flux : </w:t>
+      </w:r>
+      <w:r>
+        <w:t xml:space="preserve">les deux ou trois qui pèsent le plus sur le CFADS. Pour une centrale solaire : la production et les charges ; le prix, fixé par le contrat d’achat, ne bouge pas.</w:t>
       </w:r>
     </w:p>
     <w:p>
@@ -3371,19 +3712,19 @@
         <w:pStyle w:val="ListParagraph"/>
         <w:numPr>
           <w:ilvl w:val="0"/>
-          <w:numId w:val="2"/>
+          <w:numId w:val="4"/>
         </w:numPr>
-        <w:spacing w:after="70" w:line="290"/>
+        <w:spacing w:after="90" w:line="290"/>
       </w:pPr>
       <w:r>
         <w:rPr>
           <w:b/>
           <w:bCs/>
         </w:rPr>
-        <w:t xml:space="preserve">Rester sévère mais plausible : </w:t>
-      </w:r>
-      <w:r>
-        <w:t xml:space="preserve">un scénario qui peut arriver pendant la durée du prêt, pas une catastrophe sans précédent, ni un simple aléa.</w:t>
+        <w:t xml:space="preserve">Trouver un niveau défavorable mais plausible : </w:t>
+      </w:r>
+      <w:r>
+        <w:t xml:space="preserve">la règle courante est un événement qui arrive environ une année sur dix, sévère mais réaliste sur la durée du prêt.</w:t>
       </w:r>
     </w:p>
     <w:p>
@@ -3391,59 +3732,27 @@
         <w:pStyle w:val="ListParagraph"/>
         <w:numPr>
           <w:ilvl w:val="0"/>
-          <w:numId w:val="2"/>
+          <w:numId w:val="4"/>
         </w:numPr>
-        <w:spacing w:after="70" w:line="290"/>
+        <w:spacing w:after="90" w:line="290"/>
       </w:pPr>
       <w:r>
         <w:rPr>
           <w:b/>
           <w:bCs/>
         </w:rPr>
-        <w:t xml:space="preserve">S’appuyer sur des sources : </w:t>
-      </w:r>
-      <w:r>
-        <w:t xml:space="preserve">étude de ressource (P90), conseiller technique ou de marché, historique du secteur, « banking case » des prêteurs.</w:t>
-      </w:r>
-    </w:p>
-    <w:p>
-      <w:pPr>
-        <w:pStyle w:val="ListParagraph"/>
-        <w:numPr>
-          <w:ilvl w:val="0"/>
-          <w:numId w:val="2"/>
-        </w:numPr>
-        <w:spacing w:after="70" w:line="290"/>
-      </w:pPr>
-      <w:r>
-        <w:rPr>
-          <w:b/>
-          <w:bCs/>
-        </w:rPr>
-        <w:t xml:space="preserve">Tenir compte des protections contractuelles : </w:t>
-      </w:r>
-      <w:r>
-        <w:t xml:space="preserve">un contrat take-or-pay protège des volumes, une clause d’indexation protège des coûts. Le scénario doit viser ce qui n’est pas couvert.</w:t>
-      </w:r>
-    </w:p>
-    <w:p>
-      <w:pPr>
-        <w:pStyle w:val="ListParagraph"/>
-        <w:numPr>
-          <w:ilvl w:val="0"/>
-          <w:numId w:val="2"/>
-        </w:numPr>
-        <w:spacing w:after="70" w:line="290"/>
-      </w:pPr>
-      <w:r>
-        <w:rPr>
-          <w:b/>
-          <w:bCs/>
-        </w:rPr>
-        <w:t xml:space="preserve">Le décrire et le justifier </w:t>
-      </w:r>
-      <w:r>
-        <w:t xml:space="preserve">dans la saisie : le comité doit pouvoir le discuter.</w:t>
+        <w:t xml:space="preserve">Le justifier par une source : </w:t>
+      </w:r>
+      <w:r>
+        <w:t xml:space="preserve">étude d’expert (productible, trafic, marché), historique (crises, sécheresses, cycles de prix) ou contrat (ce qui n’est pas couvert : minimum garanti, plafond de pénalités, indexation).</w:t>
+      </w:r>
+    </w:p>
+    <w:p>
+      <w:pPr>
+        <w:pStyle w:val="Heading2"/>
+      </w:pPr>
+      <w:r>
+        <w:t xml:space="preserve">Exemple : d’où vient « production − 8 % » ?</w:t>
       </w:r>
     </w:p>
     <w:p>
@@ -3451,7 +3760,40 @@
         <w:spacing w:after="140" w:line="300"/>
       </w:pPr>
       <w:r>
-        <w:t xml:space="preserve">Scénarios retenus dans les cas de test, par secteur :</w:t>
+        <w:t xml:space="preserve">De l’étude de productible, réalisée par un conseiller technique indépendant pour tout projet solaire ou éolien financé. Elle donne la production attendue, le P50 (une chance sur deux d’être dépassée), et l’incertitude qui l’entoure : variabilité de l’ensoleillement d’une année à l’autre, précision des mesures, modèle de calcul. Pour le solaire, cette incertitude tourne autour de 6 % sur un an. Le P90, production dépassée 9 années sur 10, vaut alors P50 × (1 − 1,28 × 6 %) ≈ P50 − 8 %. Le chiffre se lit dans l’étude du projet. Pour l’éolien, plus variable, l’écart est souvent de 10 à 15 %.</w:t>
+      </w:r>
+    </w:p>
+    <w:p>
+      <w:pPr>
+        <w:pStyle w:val="Heading2"/>
+      </w:pPr>
+      <w:r>
+        <w:t xml:space="preserve">Et « charges + 10 % » ?</w:t>
+      </w:r>
+    </w:p>
+    <w:p>
+      <w:pPr>
+        <w:spacing w:after="140" w:line="300"/>
+      </w:pPr>
+      <w:r>
+        <w:t xml:space="preserve">On part du contrat d’exploitation et maintenance : une partie des charges est couverte (prix forfaitaire indexé), une partie ne l’est pas (dérive de l’inflation au-delà de l’indice, réparations imprévues, primes d’assurance). Le + 10 % est la sensibilité usuelle appliquée par les prêteurs ; on l’ajuste à la baisse si le contrat est ferme sur longue durée, à la hausse si les charges sont mal maîtrisées.</w:t>
+      </w:r>
+    </w:p>
+    <w:p>
+      <w:pPr>
+        <w:pStyle w:val="Heading2"/>
+      </w:pPr>
+      <w:r>
+        <w:t xml:space="preserve">La bibliothèque de référence de l’outil</w:t>
+      </w:r>
+    </w:p>
+    <w:p>
+      <w:pPr>
+        <w:keepNext/>
+        <w:spacing w:after="140" w:line="300"/>
+      </w:pPr>
+      <w:r>
+        <w:t xml:space="preserve">L’outil propose, au bloc 6, un scénario de référence par secteur (valeurs candidates, à valider par le comité). On stresse ce que les contrats ne couvrent pas, et on chiffre ce stress avec une étude ou un historique. L’analyste peut s’en écarter en le justifiant.</w:t>
       </w:r>
     </w:p>
     <w:tbl>
@@ -3467,9 +3809,9 @@
         </w:tblBorders>
       </w:tblPr>
       <w:tblGrid>
-        <w:gridCol w:w="2327"/>
-        <w:gridCol w:w="2327"/>
-        <w:gridCol w:w="4652"/>
+        <w:gridCol w:w="2009"/>
+        <w:gridCol w:w="2855"/>
+        <w:gridCol w:w="4442"/>
       </w:tblGrid>
       <w:tr>
         <w:trPr>
@@ -3477,7 +3819,7 @@
         </w:trPr>
         <w:tc>
           <w:tcPr>
-            <w:tcW w:type="dxa" w:w="2327"/>
+            <w:tcW w:type="dxa" w:w="2009"/>
             <w:tcBorders>
               <w:top w:val="single" w:color="D9D9D9" w:sz="4"/>
               <w:left w:val="single" w:color="D9D9D9" w:sz="4"/>
@@ -3510,7 +3852,7 @@
         </w:tc>
         <w:tc>
           <w:tcPr>
-            <w:tcW w:type="dxa" w:w="2327"/>
+            <w:tcW w:type="dxa" w:w="2855"/>
             <w:tcBorders>
               <w:top w:val="single" w:color="D9D9D9" w:sz="4"/>
               <w:left w:val="single" w:color="D9D9D9" w:sz="4"/>
@@ -3537,13 +3879,13 @@
                 <w:sz w:val="20"/>
                 <w:szCs w:val="20"/>
               </w:rPr>
-              <w:t xml:space="preserve">Risque visé</w:t>
-            </w:r>
-          </w:p>
-        </w:tc>
-        <w:tc>
-          <w:tcPr>
-            <w:tcW w:type="dxa" w:w="4652"/>
+              <w:t xml:space="preserve">Hypothèses de référence</w:t>
+            </w:r>
+          </w:p>
+        </w:tc>
+        <w:tc>
+          <w:tcPr>
+            <w:tcW w:type="dxa" w:w="4442"/>
             <w:tcBorders>
               <w:top w:val="single" w:color="D9D9D9" w:sz="4"/>
               <w:left w:val="single" w:color="D9D9D9" w:sz="4"/>
@@ -3570,15 +3912,18 @@
                 <w:sz w:val="20"/>
                 <w:szCs w:val="20"/>
               </w:rPr>
-              <w:t xml:space="preserve">Exemple de scénario</w:t>
+              <w:t xml:space="preserve">D’où vient le chiffre</w:t>
             </w:r>
           </w:p>
         </w:tc>
       </w:tr>
       <w:tr>
-        <w:tc>
-          <w:tcPr>
-            <w:tcW w:type="dxa" w:w="2327"/>
+        <w:trPr>
+          <w:cantSplit/>
+        </w:trPr>
+        <w:tc>
+          <w:tcPr>
+            <w:tcW w:type="dxa" w:w="2009"/>
             <w:tcBorders>
               <w:top w:val="single" w:color="D9D9D9" w:sz="4"/>
               <w:left w:val="single" w:color="D9D9D9" w:sz="4"/>
@@ -3611,75 +3956,78 @@
         </w:tc>
         <w:tc>
           <w:tcPr>
-            <w:tcW w:type="dxa" w:w="2327"/>
-            <w:tcBorders>
-              <w:top w:val="single" w:color="D9D9D9" w:sz="4"/>
-              <w:left w:val="single" w:color="D9D9D9" w:sz="4"/>
-              <w:bottom w:val="single" w:color="D9D9D9" w:sz="4"/>
-              <w:right w:val="single" w:color="D9D9D9" w:sz="4"/>
-            </w:tcBorders>
-            <w:shd w:fill="FFFFFF" w:color="auto" w:val="clear"/>
-            <w:tcMar>
-              <w:top w:type="dxa" w:w="60"/>
-              <w:left w:type="dxa" w:w="100"/>
-              <w:bottom w:type="dxa" w:w="60"/>
-              <w:right w:type="dxa" w:w="100"/>
-            </w:tcMar>
-          </w:tcPr>
-          <w:p>
-            <w:pPr>
-              <w:jc w:val="left"/>
-            </w:pPr>
-            <w:r>
-              <w:rPr>
-                <w:b w:val="false"/>
-                <w:bCs w:val="false"/>
-                <w:color w:val="333333"/>
-                <w:sz w:val="20"/>
-                <w:szCs w:val="20"/>
-              </w:rPr>
-              <w:t xml:space="preserve">Ressource (soleil, vent)</w:t>
-            </w:r>
-          </w:p>
-        </w:tc>
-        <w:tc>
-          <w:tcPr>
-            <w:tcW w:type="dxa" w:w="4652"/>
-            <w:tcBorders>
-              <w:top w:val="single" w:color="D9D9D9" w:sz="4"/>
-              <w:left w:val="single" w:color="D9D9D9" w:sz="4"/>
-              <w:bottom w:val="single" w:color="D9D9D9" w:sz="4"/>
-              <w:right w:val="single" w:color="D9D9D9" w:sz="4"/>
-            </w:tcBorders>
-            <w:shd w:fill="FFFFFF" w:color="auto" w:val="clear"/>
-            <w:tcMar>
-              <w:top w:type="dxa" w:w="60"/>
-              <w:left w:type="dxa" w:w="100"/>
-              <w:bottom w:type="dxa" w:w="60"/>
-              <w:right w:type="dxa" w:w="100"/>
-            </w:tcMar>
-          </w:tcPr>
-          <w:p>
-            <w:pPr>
-              <w:jc w:val="left"/>
-            </w:pPr>
-            <w:r>
-              <w:rPr>
-                <w:b w:val="false"/>
-                <w:bCs w:val="false"/>
-                <w:color w:val="333333"/>
-                <w:sz w:val="20"/>
-                <w:szCs w:val="20"/>
-              </w:rPr>
-              <w:t xml:space="preserve">Production P90 et charges + 5 à 10 %</w:t>
+            <w:tcW w:type="dxa" w:w="2855"/>
+            <w:tcBorders>
+              <w:top w:val="single" w:color="D9D9D9" w:sz="4"/>
+              <w:left w:val="single" w:color="D9D9D9" w:sz="4"/>
+              <w:bottom w:val="single" w:color="D9D9D9" w:sz="4"/>
+              <w:right w:val="single" w:color="D9D9D9" w:sz="4"/>
+            </w:tcBorders>
+            <w:shd w:fill="FFFFFF" w:color="auto" w:val="clear"/>
+            <w:tcMar>
+              <w:top w:type="dxa" w:w="60"/>
+              <w:left w:type="dxa" w:w="100"/>
+              <w:bottom w:type="dxa" w:w="60"/>
+              <w:right w:type="dxa" w:w="100"/>
+            </w:tcMar>
+          </w:tcPr>
+          <w:p>
+            <w:pPr>
+              <w:jc w:val="left"/>
+            </w:pPr>
+            <w:r>
+              <w:rPr>
+                <w:b w:val="false"/>
+                <w:bCs w:val="false"/>
+                <w:color w:val="333333"/>
+                <w:sz w:val="20"/>
+                <w:szCs w:val="20"/>
+              </w:rPr>
+              <w:t xml:space="preserve">Production P90 (− 8 %), charges + 10 %</w:t>
+            </w:r>
+          </w:p>
+        </w:tc>
+        <w:tc>
+          <w:tcPr>
+            <w:tcW w:type="dxa" w:w="4442"/>
+            <w:tcBorders>
+              <w:top w:val="single" w:color="D9D9D9" w:sz="4"/>
+              <w:left w:val="single" w:color="D9D9D9" w:sz="4"/>
+              <w:bottom w:val="single" w:color="D9D9D9" w:sz="4"/>
+              <w:right w:val="single" w:color="D9D9D9" w:sz="4"/>
+            </w:tcBorders>
+            <w:shd w:fill="FFFFFF" w:color="auto" w:val="clear"/>
+            <w:tcMar>
+              <w:top w:type="dxa" w:w="60"/>
+              <w:left w:type="dxa" w:w="100"/>
+              <w:bottom w:type="dxa" w:w="60"/>
+              <w:right w:type="dxa" w:w="100"/>
+            </w:tcMar>
+          </w:tcPr>
+          <w:p>
+            <w:pPr>
+              <w:jc w:val="left"/>
+            </w:pPr>
+            <w:r>
+              <w:rPr>
+                <w:b w:val="false"/>
+                <w:bCs w:val="false"/>
+                <w:color w:val="333333"/>
+                <w:sz w:val="20"/>
+                <w:szCs w:val="20"/>
+              </w:rPr>
+              <w:t xml:space="preserve">Étude de productible (écart P50/P90 à un an) ; sensibilité usuelle des prêteurs sur les charges</w:t>
             </w:r>
           </w:p>
         </w:tc>
       </w:tr>
       <w:tr>
-        <w:tc>
-          <w:tcPr>
-            <w:tcW w:type="dxa" w:w="2327"/>
+        <w:trPr>
+          <w:cantSplit/>
+        </w:trPr>
+        <w:tc>
+          <w:tcPr>
+            <w:tcW w:type="dxa" w:w="2009"/>
             <w:tcBorders>
               <w:top w:val="single" w:color="D9D9D9" w:sz="4"/>
               <w:left w:val="single" w:color="D9D9D9" w:sz="4"/>
@@ -3712,75 +4060,78 @@
         </w:tc>
         <w:tc>
           <w:tcPr>
-            <w:tcW w:type="dxa" w:w="2327"/>
-            <w:tcBorders>
-              <w:top w:val="single" w:color="D9D9D9" w:sz="4"/>
-              <w:left w:val="single" w:color="D9D9D9" w:sz="4"/>
-              <w:bottom w:val="single" w:color="D9D9D9" w:sz="4"/>
-              <w:right w:val="single" w:color="D9D9D9" w:sz="4"/>
-            </w:tcBorders>
-            <w:shd w:fill="FFFFFF" w:color="auto" w:val="clear"/>
-            <w:tcMar>
-              <w:top w:type="dxa" w:w="60"/>
-              <w:left w:type="dxa" w:w="100"/>
-              <w:bottom w:type="dxa" w:w="60"/>
-              <w:right w:type="dxa" w:w="100"/>
-            </w:tcMar>
-          </w:tcPr>
-          <w:p>
-            <w:pPr>
-              <w:jc w:val="left"/>
-            </w:pPr>
-            <w:r>
-              <w:rPr>
-                <w:b w:val="false"/>
-                <w:bCs w:val="false"/>
-                <w:color w:val="333333"/>
-                <w:sz w:val="20"/>
-                <w:szCs w:val="20"/>
-              </w:rPr>
-              <w:t xml:space="preserve">Énergie, disponibilité</w:t>
-            </w:r>
-          </w:p>
-        </w:tc>
-        <w:tc>
-          <w:tcPr>
-            <w:tcW w:type="dxa" w:w="4652"/>
-            <w:tcBorders>
-              <w:top w:val="single" w:color="D9D9D9" w:sz="4"/>
-              <w:left w:val="single" w:color="D9D9D9" w:sz="4"/>
-              <w:bottom w:val="single" w:color="D9D9D9" w:sz="4"/>
-              <w:right w:val="single" w:color="D9D9D9" w:sz="4"/>
-            </w:tcBorders>
-            <w:shd w:fill="FFFFFF" w:color="auto" w:val="clear"/>
-            <w:tcMar>
-              <w:top w:type="dxa" w:w="60"/>
-              <w:left w:type="dxa" w:w="100"/>
-              <w:bottom w:type="dxa" w:w="60"/>
-              <w:right w:type="dxa" w:w="100"/>
-            </w:tcMar>
-          </w:tcPr>
-          <w:p>
-            <w:pPr>
-              <w:jc w:val="left"/>
-            </w:pPr>
-            <w:r>
-              <w:rPr>
-                <w:b w:val="false"/>
-                <w:bCs w:val="false"/>
-                <w:color w:val="333333"/>
-                <w:sz w:val="20"/>
-                <w:szCs w:val="20"/>
-              </w:rPr>
-              <w:t xml:space="preserve">Coût de l’énergie non répercuté, disponibilité 92–93 %</w:t>
+            <w:tcW w:type="dxa" w:w="2855"/>
+            <w:tcBorders>
+              <w:top w:val="single" w:color="D9D9D9" w:sz="4"/>
+              <w:left w:val="single" w:color="D9D9D9" w:sz="4"/>
+              <w:bottom w:val="single" w:color="D9D9D9" w:sz="4"/>
+              <w:right w:val="single" w:color="D9D9D9" w:sz="4"/>
+            </w:tcBorders>
+            <w:shd w:fill="FFFFFF" w:color="auto" w:val="clear"/>
+            <w:tcMar>
+              <w:top w:type="dxa" w:w="60"/>
+              <w:left w:type="dxa" w:w="100"/>
+              <w:bottom w:type="dxa" w:w="60"/>
+              <w:right w:type="dxa" w:w="100"/>
+            </w:tcMar>
+          </w:tcPr>
+          <w:p>
+            <w:pPr>
+              <w:jc w:val="left"/>
+            </w:pPr>
+            <w:r>
+              <w:rPr>
+                <w:b w:val="false"/>
+                <w:bCs w:val="false"/>
+                <w:color w:val="333333"/>
+                <w:sz w:val="20"/>
+                <w:szCs w:val="20"/>
+              </w:rPr>
+              <w:t xml:space="preserve">Recettes − 5 %, charges + 15 %</w:t>
+            </w:r>
+          </w:p>
+        </w:tc>
+        <w:tc>
+          <w:tcPr>
+            <w:tcW w:type="dxa" w:w="4442"/>
+            <w:tcBorders>
+              <w:top w:val="single" w:color="D9D9D9" w:sz="4"/>
+              <w:left w:val="single" w:color="D9D9D9" w:sz="4"/>
+              <w:bottom w:val="single" w:color="D9D9D9" w:sz="4"/>
+              <w:right w:val="single" w:color="D9D9D9" w:sz="4"/>
+            </w:tcBorders>
+            <w:shd w:fill="FFFFFF" w:color="auto" w:val="clear"/>
+            <w:tcMar>
+              <w:top w:type="dxa" w:w="60"/>
+              <w:left w:type="dxa" w:w="100"/>
+              <w:bottom w:type="dxa" w:w="60"/>
+              <w:right w:type="dxa" w:w="100"/>
+            </w:tcMar>
+          </w:tcPr>
+          <w:p>
+            <w:pPr>
+              <w:jc w:val="left"/>
+            </w:pPr>
+            <w:r>
+              <w:rPr>
+                <w:b w:val="false"/>
+                <w:bCs w:val="false"/>
+                <w:color w:val="333333"/>
+                <w:sz w:val="20"/>
+                <w:szCs w:val="20"/>
+              </w:rPr>
+              <w:t xml:space="preserve">Disponibilité garantie aux contrats EPC et O&amp;M ; part du coût de l’énergie non répercutée par la formule de redevance</w:t>
             </w:r>
           </w:p>
         </w:tc>
       </w:tr>
       <w:tr>
-        <w:tc>
-          <w:tcPr>
-            <w:tcW w:type="dxa" w:w="2327"/>
+        <w:trPr>
+          <w:cantSplit/>
+        </w:trPr>
+        <w:tc>
+          <w:tcPr>
+            <w:tcW w:type="dxa" w:w="2009"/>
             <w:tcBorders>
               <w:top w:val="single" w:color="D9D9D9" w:sz="4"/>
               <w:left w:val="single" w:color="D9D9D9" w:sz="4"/>
@@ -3807,81 +4158,84 @@
                 <w:sz w:val="20"/>
                 <w:szCs w:val="20"/>
               </w:rPr>
-              <w:t xml:space="preserve">Thermique</w:t>
-            </w:r>
-          </w:p>
-        </w:tc>
-        <w:tc>
-          <w:tcPr>
-            <w:tcW w:type="dxa" w:w="2327"/>
-            <w:tcBorders>
-              <w:top w:val="single" w:color="D9D9D9" w:sz="4"/>
-              <w:left w:val="single" w:color="D9D9D9" w:sz="4"/>
-              <w:bottom w:val="single" w:color="D9D9D9" w:sz="4"/>
-              <w:right w:val="single" w:color="D9D9D9" w:sz="4"/>
-            </w:tcBorders>
-            <w:shd w:fill="FFFFFF" w:color="auto" w:val="clear"/>
-            <w:tcMar>
-              <w:top w:type="dxa" w:w="60"/>
-              <w:left w:type="dxa" w:w="100"/>
-              <w:bottom w:type="dxa" w:w="60"/>
-              <w:right w:type="dxa" w:w="100"/>
-            </w:tcMar>
-          </w:tcPr>
-          <w:p>
-            <w:pPr>
-              <w:jc w:val="left"/>
-            </w:pPr>
-            <w:r>
-              <w:rPr>
-                <w:b w:val="false"/>
-                <w:bCs w:val="false"/>
-                <w:color w:val="333333"/>
-                <w:sz w:val="20"/>
-                <w:szCs w:val="20"/>
-              </w:rPr>
-              <w:t xml:space="preserve">Disponibilité technique</w:t>
-            </w:r>
-          </w:p>
-        </w:tc>
-        <w:tc>
-          <w:tcPr>
-            <w:tcW w:type="dxa" w:w="4652"/>
-            <w:tcBorders>
-              <w:top w:val="single" w:color="D9D9D9" w:sz="4"/>
-              <w:left w:val="single" w:color="D9D9D9" w:sz="4"/>
-              <w:bottom w:val="single" w:color="D9D9D9" w:sz="4"/>
-              <w:right w:val="single" w:color="D9D9D9" w:sz="4"/>
-            </w:tcBorders>
-            <w:shd w:fill="FFFFFF" w:color="auto" w:val="clear"/>
-            <w:tcMar>
-              <w:top w:type="dxa" w:w="60"/>
-              <w:left w:type="dxa" w:w="100"/>
-              <w:bottom w:type="dxa" w:w="60"/>
-              <w:right w:type="dxa" w:w="100"/>
-            </w:tcMar>
-          </w:tcPr>
-          <w:p>
-            <w:pPr>
-              <w:jc w:val="left"/>
-            </w:pPr>
-            <w:r>
-              <w:rPr>
-                <w:b w:val="false"/>
-                <w:bCs w:val="false"/>
-                <w:color w:val="333333"/>
-                <w:sz w:val="20"/>
-                <w:szCs w:val="20"/>
-              </w:rPr>
-              <w:t xml:space="preserve">Indisponibilité d’une turbine pendant 6 mois</w:t>
+              <w:t xml:space="preserve">Télécom, data centers</w:t>
+            </w:r>
+          </w:p>
+        </w:tc>
+        <w:tc>
+          <w:tcPr>
+            <w:tcW w:type="dxa" w:w="2855"/>
+            <w:tcBorders>
+              <w:top w:val="single" w:color="D9D9D9" w:sz="4"/>
+              <w:left w:val="single" w:color="D9D9D9" w:sz="4"/>
+              <w:bottom w:val="single" w:color="D9D9D9" w:sz="4"/>
+              <w:right w:val="single" w:color="D9D9D9" w:sz="4"/>
+            </w:tcBorders>
+            <w:shd w:fill="FFFFFF" w:color="auto" w:val="clear"/>
+            <w:tcMar>
+              <w:top w:type="dxa" w:w="60"/>
+              <w:left w:type="dxa" w:w="100"/>
+              <w:bottom w:type="dxa" w:w="60"/>
+              <w:right w:type="dxa" w:w="100"/>
+            </w:tcMar>
+          </w:tcPr>
+          <w:p>
+            <w:pPr>
+              <w:jc w:val="left"/>
+            </w:pPr>
+            <w:r>
+              <w:rPr>
+                <w:b w:val="false"/>
+                <w:bCs w:val="false"/>
+                <w:color w:val="333333"/>
+                <w:sz w:val="20"/>
+                <w:szCs w:val="20"/>
+              </w:rPr>
+              <w:t xml:space="preserve">Recettes − 20 %, charges + 5 %</w:t>
+            </w:r>
+          </w:p>
+        </w:tc>
+        <w:tc>
+          <w:tcPr>
+            <w:tcW w:type="dxa" w:w="4442"/>
+            <w:tcBorders>
+              <w:top w:val="single" w:color="D9D9D9" w:sz="4"/>
+              <w:left w:val="single" w:color="D9D9D9" w:sz="4"/>
+              <w:bottom w:val="single" w:color="D9D9D9" w:sz="4"/>
+              <w:right w:val="single" w:color="D9D9D9" w:sz="4"/>
+            </w:tcBorders>
+            <w:shd w:fill="FFFFFF" w:color="auto" w:val="clear"/>
+            <w:tcMar>
+              <w:top w:type="dxa" w:w="60"/>
+              <w:left w:type="dxa" w:w="100"/>
+              <w:bottom w:type="dxa" w:w="60"/>
+              <w:right w:type="dxa" w:w="100"/>
+            </w:tcMar>
+          </w:tcPr>
+          <w:p>
+            <w:pPr>
+              <w:jc w:val="left"/>
+            </w:pPr>
+            <w:r>
+              <w:rPr>
+                <w:b w:val="false"/>
+                <w:bCs w:val="false"/>
+                <w:color w:val="333333"/>
+                <w:sz w:val="20"/>
+                <w:szCs w:val="20"/>
+              </w:rPr>
+              <w:t xml:space="preserve">Étude de marché ; clauses de sortie des contrats clients</w:t>
             </w:r>
           </w:p>
         </w:tc>
       </w:tr>
       <w:tr>
-        <w:tc>
-          <w:tcPr>
-            <w:tcW w:type="dxa" w:w="2327"/>
+        <w:trPr>
+          <w:cantSplit/>
+        </w:trPr>
+        <w:tc>
+          <w:tcPr>
+            <w:tcW w:type="dxa" w:w="2009"/>
             <w:tcBorders>
               <w:top w:val="single" w:color="D9D9D9" w:sz="4"/>
               <w:left w:val="single" w:color="D9D9D9" w:sz="4"/>
@@ -3908,81 +4262,84 @@
                 <w:sz w:val="20"/>
                 <w:szCs w:val="20"/>
               </w:rPr>
-              <w:t xml:space="preserve">Autoroutes, ports</w:t>
-            </w:r>
-          </w:p>
-        </w:tc>
-        <w:tc>
-          <w:tcPr>
-            <w:tcW w:type="dxa" w:w="2327"/>
-            <w:tcBorders>
-              <w:top w:val="single" w:color="D9D9D9" w:sz="4"/>
-              <w:left w:val="single" w:color="D9D9D9" w:sz="4"/>
-              <w:bottom w:val="single" w:color="D9D9D9" w:sz="4"/>
-              <w:right w:val="single" w:color="D9D9D9" w:sz="4"/>
-            </w:tcBorders>
-            <w:shd w:fill="FFFFFF" w:color="auto" w:val="clear"/>
-            <w:tcMar>
-              <w:top w:type="dxa" w:w="60"/>
-              <w:left w:type="dxa" w:w="100"/>
-              <w:bottom w:type="dxa" w:w="60"/>
-              <w:right w:type="dxa" w:w="100"/>
-            </w:tcMar>
-          </w:tcPr>
-          <w:p>
-            <w:pPr>
-              <w:jc w:val="left"/>
-            </w:pPr>
-            <w:r>
-              <w:rPr>
-                <w:b w:val="false"/>
-                <w:bCs w:val="false"/>
-                <w:color w:val="333333"/>
-                <w:sz w:val="20"/>
-                <w:szCs w:val="20"/>
-              </w:rPr>
-              <w:t xml:space="preserve">Trafic</w:t>
-            </w:r>
-          </w:p>
-        </w:tc>
-        <w:tc>
-          <w:tcPr>
-            <w:tcW w:type="dxa" w:w="4652"/>
-            <w:tcBorders>
-              <w:top w:val="single" w:color="D9D9D9" w:sz="4"/>
-              <w:left w:val="single" w:color="D9D9D9" w:sz="4"/>
-              <w:bottom w:val="single" w:color="D9D9D9" w:sz="4"/>
-              <w:right w:val="single" w:color="D9D9D9" w:sz="4"/>
-            </w:tcBorders>
-            <w:shd w:fill="FFFFFF" w:color="auto" w:val="clear"/>
-            <w:tcMar>
-              <w:top w:type="dxa" w:w="60"/>
-              <w:left w:type="dxa" w:w="100"/>
-              <w:bottom w:type="dxa" w:w="60"/>
-              <w:right w:type="dxa" w:w="100"/>
-            </w:tcMar>
-          </w:tcPr>
-          <w:p>
-            <w:pPr>
-              <w:jc w:val="left"/>
-            </w:pPr>
-            <w:r>
-              <w:rPr>
-                <w:b w:val="false"/>
-                <w:bCs w:val="false"/>
-                <w:color w:val="333333"/>
-                <w:sz w:val="20"/>
-                <w:szCs w:val="20"/>
-              </w:rPr>
-              <w:t xml:space="preserve">Trafic − 15 %, ou ramené au minimum garanti</w:t>
+              <w:t xml:space="preserve">Transport</w:t>
+            </w:r>
+          </w:p>
+        </w:tc>
+        <w:tc>
+          <w:tcPr>
+            <w:tcW w:type="dxa" w:w="2855"/>
+            <w:tcBorders>
+              <w:top w:val="single" w:color="D9D9D9" w:sz="4"/>
+              <w:left w:val="single" w:color="D9D9D9" w:sz="4"/>
+              <w:bottom w:val="single" w:color="D9D9D9" w:sz="4"/>
+              <w:right w:val="single" w:color="D9D9D9" w:sz="4"/>
+            </w:tcBorders>
+            <w:shd w:fill="FFFFFF" w:color="auto" w:val="clear"/>
+            <w:tcMar>
+              <w:top w:type="dxa" w:w="60"/>
+              <w:left w:type="dxa" w:w="100"/>
+              <w:bottom w:type="dxa" w:w="60"/>
+              <w:right w:type="dxa" w:w="100"/>
+            </w:tcMar>
+          </w:tcPr>
+          <w:p>
+            <w:pPr>
+              <w:jc w:val="left"/>
+            </w:pPr>
+            <w:r>
+              <w:rPr>
+                <w:b w:val="false"/>
+                <w:bCs w:val="false"/>
+                <w:color w:val="333333"/>
+                <w:sz w:val="20"/>
+                <w:szCs w:val="20"/>
+              </w:rPr>
+              <w:t xml:space="preserve">Trafic − 15 %, charges + 10 %</w:t>
+            </w:r>
+          </w:p>
+        </w:tc>
+        <w:tc>
+          <w:tcPr>
+            <w:tcW w:type="dxa" w:w="4442"/>
+            <w:tcBorders>
+              <w:top w:val="single" w:color="D9D9D9" w:sz="4"/>
+              <w:left w:val="single" w:color="D9D9D9" w:sz="4"/>
+              <w:bottom w:val="single" w:color="D9D9D9" w:sz="4"/>
+              <w:right w:val="single" w:color="D9D9D9" w:sz="4"/>
+            </w:tcBorders>
+            <w:shd w:fill="FFFFFF" w:color="auto" w:val="clear"/>
+            <w:tcMar>
+              <w:top w:type="dxa" w:w="60"/>
+              <w:left w:type="dxa" w:w="100"/>
+              <w:bottom w:type="dxa" w:w="60"/>
+              <w:right w:type="dxa" w:w="100"/>
+            </w:tcMar>
+          </w:tcPr>
+          <w:p>
+            <w:pPr>
+              <w:jc w:val="left"/>
+            </w:pPr>
+            <w:r>
+              <w:rPr>
+                <w:b w:val="false"/>
+                <w:bCs w:val="false"/>
+                <w:color w:val="333333"/>
+                <w:sz w:val="20"/>
+                <w:szCs w:val="20"/>
+              </w:rPr>
+              <w:t xml:space="preserve">Cas bas de l’étude de trafic ; baisses observées en récession</w:t>
             </w:r>
           </w:p>
         </w:tc>
       </w:tr>
       <w:tr>
-        <w:tc>
-          <w:tcPr>
-            <w:tcW w:type="dxa" w:w="2327"/>
+        <w:trPr>
+          <w:cantSplit/>
+        </w:trPr>
+        <w:tc>
+          <w:tcPr>
+            <w:tcW w:type="dxa" w:w="2009"/>
             <w:tcBorders>
               <w:top w:val="single" w:color="D9D9D9" w:sz="4"/>
               <w:left w:val="single" w:color="D9D9D9" w:sz="4"/>
@@ -4009,81 +4366,84 @@
                 <w:sz w:val="20"/>
                 <w:szCs w:val="20"/>
               </w:rPr>
-              <w:t xml:space="preserve">Tourisme</w:t>
-            </w:r>
-          </w:p>
-        </w:tc>
-        <w:tc>
-          <w:tcPr>
-            <w:tcW w:type="dxa" w:w="2327"/>
-            <w:tcBorders>
-              <w:top w:val="single" w:color="D9D9D9" w:sz="4"/>
-              <w:left w:val="single" w:color="D9D9D9" w:sz="4"/>
-              <w:bottom w:val="single" w:color="D9D9D9" w:sz="4"/>
-              <w:right w:val="single" w:color="D9D9D9" w:sz="4"/>
-            </w:tcBorders>
-            <w:shd w:fill="FFFFFF" w:color="auto" w:val="clear"/>
-            <w:tcMar>
-              <w:top w:type="dxa" w:w="60"/>
-              <w:left w:type="dxa" w:w="100"/>
-              <w:bottom w:type="dxa" w:w="60"/>
-              <w:right w:type="dxa" w:w="100"/>
-            </w:tcMar>
-          </w:tcPr>
-          <w:p>
-            <w:pPr>
-              <w:jc w:val="left"/>
-            </w:pPr>
-            <w:r>
-              <w:rPr>
-                <w:b w:val="false"/>
-                <w:bCs w:val="false"/>
-                <w:color w:val="333333"/>
-                <w:sz w:val="20"/>
-                <w:szCs w:val="20"/>
-              </w:rPr>
-              <w:t xml:space="preserve">Fréquentation et prix</w:t>
-            </w:r>
-          </w:p>
-        </w:tc>
-        <w:tc>
-          <w:tcPr>
-            <w:tcW w:type="dxa" w:w="4652"/>
-            <w:tcBorders>
-              <w:top w:val="single" w:color="D9D9D9" w:sz="4"/>
-              <w:left w:val="single" w:color="D9D9D9" w:sz="4"/>
-              <w:bottom w:val="single" w:color="D9D9D9" w:sz="4"/>
-              <w:right w:val="single" w:color="D9D9D9" w:sz="4"/>
-            </w:tcBorders>
-            <w:shd w:fill="FFFFFF" w:color="auto" w:val="clear"/>
-            <w:tcMar>
-              <w:top w:type="dxa" w:w="60"/>
-              <w:left w:type="dxa" w:w="100"/>
-              <w:bottom w:type="dxa" w:w="60"/>
-              <w:right w:type="dxa" w:w="100"/>
-            </w:tcMar>
-          </w:tcPr>
-          <w:p>
-            <w:pPr>
-              <w:jc w:val="left"/>
-            </w:pPr>
-            <w:r>
-              <w:rPr>
-                <w:b w:val="false"/>
-                <w:bCs w:val="false"/>
-                <w:color w:val="333333"/>
-                <w:sz w:val="20"/>
-                <w:szCs w:val="20"/>
-              </w:rPr>
-              <w:t xml:space="preserve">Occupation − 10 à − 15 points, prix − 10 %</w:t>
+              <w:t xml:space="preserve">Ports et logistique</w:t>
+            </w:r>
+          </w:p>
+        </w:tc>
+        <w:tc>
+          <w:tcPr>
+            <w:tcW w:type="dxa" w:w="2855"/>
+            <w:tcBorders>
+              <w:top w:val="single" w:color="D9D9D9" w:sz="4"/>
+              <w:left w:val="single" w:color="D9D9D9" w:sz="4"/>
+              <w:bottom w:val="single" w:color="D9D9D9" w:sz="4"/>
+              <w:right w:val="single" w:color="D9D9D9" w:sz="4"/>
+            </w:tcBorders>
+            <w:shd w:fill="FFFFFF" w:color="auto" w:val="clear"/>
+            <w:tcMar>
+              <w:top w:type="dxa" w:w="60"/>
+              <w:left w:type="dxa" w:w="100"/>
+              <w:bottom w:type="dxa" w:w="60"/>
+              <w:right w:type="dxa" w:w="100"/>
+            </w:tcMar>
+          </w:tcPr>
+          <w:p>
+            <w:pPr>
+              <w:jc w:val="left"/>
+            </w:pPr>
+            <w:r>
+              <w:rPr>
+                <w:b w:val="false"/>
+                <w:bCs w:val="false"/>
+                <w:color w:val="333333"/>
+                <w:sz w:val="20"/>
+                <w:szCs w:val="20"/>
+              </w:rPr>
+              <w:t xml:space="preserve">Volumes − 15 %, charges + 5 %</w:t>
+            </w:r>
+          </w:p>
+        </w:tc>
+        <w:tc>
+          <w:tcPr>
+            <w:tcW w:type="dxa" w:w="4442"/>
+            <w:tcBorders>
+              <w:top w:val="single" w:color="D9D9D9" w:sz="4"/>
+              <w:left w:val="single" w:color="D9D9D9" w:sz="4"/>
+              <w:bottom w:val="single" w:color="D9D9D9" w:sz="4"/>
+              <w:right w:val="single" w:color="D9D9D9" w:sz="4"/>
+            </w:tcBorders>
+            <w:shd w:fill="FFFFFF" w:color="auto" w:val="clear"/>
+            <w:tcMar>
+              <w:top w:type="dxa" w:w="60"/>
+              <w:left w:type="dxa" w:w="100"/>
+              <w:bottom w:type="dxa" w:w="60"/>
+              <w:right w:type="dxa" w:w="100"/>
+            </w:tcMar>
+          </w:tcPr>
+          <w:p>
+            <w:pPr>
+              <w:jc w:val="left"/>
+            </w:pPr>
+            <w:r>
+              <w:rPr>
+                <w:b w:val="false"/>
+                <w:bCs w:val="false"/>
+                <w:color w:val="333333"/>
+                <w:sz w:val="20"/>
+                <w:szCs w:val="20"/>
+              </w:rPr>
+              <w:t xml:space="preserve">Étude de trafic ; volume minimum garanti</w:t>
             </w:r>
           </w:p>
         </w:tc>
       </w:tr>
       <w:tr>
-        <w:tc>
-          <w:tcPr>
-            <w:tcW w:type="dxa" w:w="2327"/>
+        <w:trPr>
+          <w:cantSplit/>
+        </w:trPr>
+        <w:tc>
+          <w:tcPr>
+            <w:tcW w:type="dxa" w:w="2009"/>
             <w:tcBorders>
               <w:top w:val="single" w:color="D9D9D9" w:sz="4"/>
               <w:left w:val="single" w:color="D9D9D9" w:sz="4"/>
@@ -4110,81 +4470,84 @@
                 <w:sz w:val="20"/>
                 <w:szCs w:val="20"/>
               </w:rPr>
-              <w:t xml:space="preserve">Agro-industrie</w:t>
-            </w:r>
-          </w:p>
-        </w:tc>
-        <w:tc>
-          <w:tcPr>
-            <w:tcW w:type="dxa" w:w="2327"/>
-            <w:tcBorders>
-              <w:top w:val="single" w:color="D9D9D9" w:sz="4"/>
-              <w:left w:val="single" w:color="D9D9D9" w:sz="4"/>
-              <w:bottom w:val="single" w:color="D9D9D9" w:sz="4"/>
-              <w:right w:val="single" w:color="D9D9D9" w:sz="4"/>
-            </w:tcBorders>
-            <w:shd w:fill="FFFFFF" w:color="auto" w:val="clear"/>
-            <w:tcMar>
-              <w:top w:type="dxa" w:w="60"/>
-              <w:left w:type="dxa" w:w="100"/>
-              <w:bottom w:type="dxa" w:w="60"/>
-              <w:right w:type="dxa" w:w="100"/>
-            </w:tcMar>
-          </w:tcPr>
-          <w:p>
-            <w:pPr>
-              <w:jc w:val="left"/>
-            </w:pPr>
-            <w:r>
-              <w:rPr>
-                <w:b w:val="false"/>
-                <w:bCs w:val="false"/>
-                <w:color w:val="333333"/>
-                <w:sz w:val="20"/>
-                <w:szCs w:val="20"/>
-              </w:rPr>
-              <w:t xml:space="preserve">Récolte, climat</w:t>
-            </w:r>
-          </w:p>
-        </w:tc>
-        <w:tc>
-          <w:tcPr>
-            <w:tcW w:type="dxa" w:w="4652"/>
-            <w:tcBorders>
-              <w:top w:val="single" w:color="D9D9D9" w:sz="4"/>
-              <w:left w:val="single" w:color="D9D9D9" w:sz="4"/>
-              <w:bottom w:val="single" w:color="D9D9D9" w:sz="4"/>
-              <w:right w:val="single" w:color="D9D9D9" w:sz="4"/>
-            </w:tcBorders>
-            <w:shd w:fill="FFFFFF" w:color="auto" w:val="clear"/>
-            <w:tcMar>
-              <w:top w:type="dxa" w:w="60"/>
-              <w:left w:type="dxa" w:w="100"/>
-              <w:bottom w:type="dxa" w:w="60"/>
-              <w:right w:type="dxa" w:w="100"/>
-            </w:tcMar>
-          </w:tcPr>
-          <w:p>
-            <w:pPr>
-              <w:jc w:val="left"/>
-            </w:pPr>
-            <w:r>
-              <w:rPr>
-                <w:b w:val="false"/>
-                <w:bCs w:val="false"/>
-                <w:color w:val="333333"/>
-                <w:sz w:val="20"/>
-                <w:szCs w:val="20"/>
-              </w:rPr>
-              <w:t xml:space="preserve">Récolte − 20 à − 25 % (stress hydrique)</w:t>
+              <w:t xml:space="preserve">Santé en PPP</w:t>
+            </w:r>
+          </w:p>
+        </w:tc>
+        <w:tc>
+          <w:tcPr>
+            <w:tcW w:type="dxa" w:w="2855"/>
+            <w:tcBorders>
+              <w:top w:val="single" w:color="D9D9D9" w:sz="4"/>
+              <w:left w:val="single" w:color="D9D9D9" w:sz="4"/>
+              <w:bottom w:val="single" w:color="D9D9D9" w:sz="4"/>
+              <w:right w:val="single" w:color="D9D9D9" w:sz="4"/>
+            </w:tcBorders>
+            <w:shd w:fill="FFFFFF" w:color="auto" w:val="clear"/>
+            <w:tcMar>
+              <w:top w:type="dxa" w:w="60"/>
+              <w:left w:type="dxa" w:w="100"/>
+              <w:bottom w:type="dxa" w:w="60"/>
+              <w:right w:type="dxa" w:w="100"/>
+            </w:tcMar>
+          </w:tcPr>
+          <w:p>
+            <w:pPr>
+              <w:jc w:val="left"/>
+            </w:pPr>
+            <w:r>
+              <w:rPr>
+                <w:b w:val="false"/>
+                <w:bCs w:val="false"/>
+                <w:color w:val="333333"/>
+                <w:sz w:val="20"/>
+                <w:szCs w:val="20"/>
+              </w:rPr>
+              <w:t xml:space="preserve">Recettes − 5 %, charges + 10 %</w:t>
+            </w:r>
+          </w:p>
+        </w:tc>
+        <w:tc>
+          <w:tcPr>
+            <w:tcW w:type="dxa" w:w="4442"/>
+            <w:tcBorders>
+              <w:top w:val="single" w:color="D9D9D9" w:sz="4"/>
+              <w:left w:val="single" w:color="D9D9D9" w:sz="4"/>
+              <w:bottom w:val="single" w:color="D9D9D9" w:sz="4"/>
+              <w:right w:val="single" w:color="D9D9D9" w:sz="4"/>
+            </w:tcBorders>
+            <w:shd w:fill="FFFFFF" w:color="auto" w:val="clear"/>
+            <w:tcMar>
+              <w:top w:type="dxa" w:w="60"/>
+              <w:left w:type="dxa" w:w="100"/>
+              <w:bottom w:type="dxa" w:w="60"/>
+              <w:right w:type="dxa" w:w="100"/>
+            </w:tcMar>
+          </w:tcPr>
+          <w:p>
+            <w:pPr>
+              <w:jc w:val="left"/>
+            </w:pPr>
+            <w:r>
+              <w:rPr>
+                <w:b w:val="false"/>
+                <w:bCs w:val="false"/>
+                <w:color w:val="333333"/>
+                <w:sz w:val="20"/>
+                <w:szCs w:val="20"/>
+              </w:rPr>
+              <w:t xml:space="preserve">Plafond des pénalités du contrat de partenariat</w:t>
             </w:r>
           </w:p>
         </w:tc>
       </w:tr>
       <w:tr>
-        <w:tc>
-          <w:tcPr>
-            <w:tcW w:type="dxa" w:w="2327"/>
+        <w:trPr>
+          <w:cantSplit/>
+        </w:trPr>
+        <w:tc>
+          <w:tcPr>
+            <w:tcW w:type="dxa" w:w="2009"/>
             <w:tcBorders>
               <w:top w:val="single" w:color="D9D9D9" w:sz="4"/>
               <w:left w:val="single" w:color="D9D9D9" w:sz="4"/>
@@ -4211,81 +4574,84 @@
                 <w:sz w:val="20"/>
                 <w:szCs w:val="20"/>
               </w:rPr>
-              <w:t xml:space="preserve">Immobilier de rendement</w:t>
-            </w:r>
-          </w:p>
-        </w:tc>
-        <w:tc>
-          <w:tcPr>
-            <w:tcW w:type="dxa" w:w="2327"/>
-            <w:tcBorders>
-              <w:top w:val="single" w:color="D9D9D9" w:sz="4"/>
-              <w:left w:val="single" w:color="D9D9D9" w:sz="4"/>
-              <w:bottom w:val="single" w:color="D9D9D9" w:sz="4"/>
-              <w:right w:val="single" w:color="D9D9D9" w:sz="4"/>
-            </w:tcBorders>
-            <w:shd w:fill="FFFFFF" w:color="auto" w:val="clear"/>
-            <w:tcMar>
-              <w:top w:type="dxa" w:w="60"/>
-              <w:left w:type="dxa" w:w="100"/>
-              <w:bottom w:type="dxa" w:w="60"/>
-              <w:right w:type="dxa" w:w="100"/>
-            </w:tcMar>
-          </w:tcPr>
-          <w:p>
-            <w:pPr>
-              <w:jc w:val="left"/>
-            </w:pPr>
-            <w:r>
-              <w:rPr>
-                <w:b w:val="false"/>
-                <w:bCs w:val="false"/>
-                <w:color w:val="333333"/>
-                <w:sz w:val="20"/>
-                <w:szCs w:val="20"/>
-              </w:rPr>
-              <w:t xml:space="preserve">Vacance et loyers</w:t>
-            </w:r>
-          </w:p>
-        </w:tc>
-        <w:tc>
-          <w:tcPr>
-            <w:tcW w:type="dxa" w:w="4652"/>
-            <w:tcBorders>
-              <w:top w:val="single" w:color="D9D9D9" w:sz="4"/>
-              <w:left w:val="single" w:color="D9D9D9" w:sz="4"/>
-              <w:bottom w:val="single" w:color="D9D9D9" w:sz="4"/>
-              <w:right w:val="single" w:color="D9D9D9" w:sz="4"/>
-            </w:tcBorders>
-            <w:shd w:fill="FFFFFF" w:color="auto" w:val="clear"/>
-            <w:tcMar>
-              <w:top w:type="dxa" w:w="60"/>
-              <w:left w:type="dxa" w:w="100"/>
-              <w:bottom w:type="dxa" w:w="60"/>
-              <w:right w:type="dxa" w:w="100"/>
-            </w:tcMar>
-          </w:tcPr>
-          <w:p>
-            <w:pPr>
-              <w:jc w:val="left"/>
-            </w:pPr>
-            <w:r>
-              <w:rPr>
-                <w:b w:val="false"/>
-                <w:bCs w:val="false"/>
-                <w:color w:val="333333"/>
-                <w:sz w:val="20"/>
-                <w:szCs w:val="20"/>
-              </w:rPr>
-              <w:t xml:space="preserve">Vacance 20 %, loyers de relocation − 5 %</w:t>
+              <w:t xml:space="preserve">Thermique et gaz</w:t>
+            </w:r>
+          </w:p>
+        </w:tc>
+        <w:tc>
+          <w:tcPr>
+            <w:tcW w:type="dxa" w:w="2855"/>
+            <w:tcBorders>
+              <w:top w:val="single" w:color="D9D9D9" w:sz="4"/>
+              <w:left w:val="single" w:color="D9D9D9" w:sz="4"/>
+              <w:bottom w:val="single" w:color="D9D9D9" w:sz="4"/>
+              <w:right w:val="single" w:color="D9D9D9" w:sz="4"/>
+            </w:tcBorders>
+            <w:shd w:fill="FFFFFF" w:color="auto" w:val="clear"/>
+            <w:tcMar>
+              <w:top w:type="dxa" w:w="60"/>
+              <w:left w:type="dxa" w:w="100"/>
+              <w:bottom w:type="dxa" w:w="60"/>
+              <w:right w:type="dxa" w:w="100"/>
+            </w:tcMar>
+          </w:tcPr>
+          <w:p>
+            <w:pPr>
+              <w:jc w:val="left"/>
+            </w:pPr>
+            <w:r>
+              <w:rPr>
+                <w:b w:val="false"/>
+                <w:bCs w:val="false"/>
+                <w:color w:val="333333"/>
+                <w:sz w:val="20"/>
+                <w:szCs w:val="20"/>
+              </w:rPr>
+              <w:t xml:space="preserve">Recettes − 10 %, charges + 10 %</w:t>
+            </w:r>
+          </w:p>
+        </w:tc>
+        <w:tc>
+          <w:tcPr>
+            <w:tcW w:type="dxa" w:w="4442"/>
+            <w:tcBorders>
+              <w:top w:val="single" w:color="D9D9D9" w:sz="4"/>
+              <w:left w:val="single" w:color="D9D9D9" w:sz="4"/>
+              <w:bottom w:val="single" w:color="D9D9D9" w:sz="4"/>
+              <w:right w:val="single" w:color="D9D9D9" w:sz="4"/>
+            </w:tcBorders>
+            <w:shd w:fill="FFFFFF" w:color="auto" w:val="clear"/>
+            <w:tcMar>
+              <w:top w:type="dxa" w:w="60"/>
+              <w:left w:type="dxa" w:w="100"/>
+              <w:bottom w:type="dxa" w:w="60"/>
+              <w:right w:type="dxa" w:w="100"/>
+            </w:tcMar>
+          </w:tcPr>
+          <w:p>
+            <w:pPr>
+              <w:jc w:val="left"/>
+            </w:pPr>
+            <w:r>
+              <w:rPr>
+                <w:b w:val="false"/>
+                <w:bCs w:val="false"/>
+                <w:color w:val="333333"/>
+                <w:sz w:val="20"/>
+                <w:szCs w:val="20"/>
+              </w:rPr>
+              <w:t xml:space="preserve">Historique de disponibilité du constructeur ; franchise d’assurance perte d’exploitation</w:t>
             </w:r>
           </w:p>
         </w:tc>
       </w:tr>
       <w:tr>
-        <w:tc>
-          <w:tcPr>
-            <w:tcW w:type="dxa" w:w="2327"/>
+        <w:trPr>
+          <w:cantSplit/>
+        </w:trPr>
+        <w:tc>
+          <w:tcPr>
+            <w:tcW w:type="dxa" w:w="2009"/>
             <w:tcBorders>
               <w:top w:val="single" w:color="D9D9D9" w:sz="4"/>
               <w:left w:val="single" w:color="D9D9D9" w:sz="4"/>
@@ -4312,81 +4678,84 @@
                 <w:sz w:val="20"/>
                 <w:szCs w:val="20"/>
               </w:rPr>
-              <w:t xml:space="preserve">Mines</w:t>
-            </w:r>
-          </w:p>
-        </w:tc>
-        <w:tc>
-          <w:tcPr>
-            <w:tcW w:type="dxa" w:w="2327"/>
-            <w:tcBorders>
-              <w:top w:val="single" w:color="D9D9D9" w:sz="4"/>
-              <w:left w:val="single" w:color="D9D9D9" w:sz="4"/>
-              <w:bottom w:val="single" w:color="D9D9D9" w:sz="4"/>
-              <w:right w:val="single" w:color="D9D9D9" w:sz="4"/>
-            </w:tcBorders>
-            <w:shd w:fill="FFFFFF" w:color="auto" w:val="clear"/>
-            <w:tcMar>
-              <w:top w:type="dxa" w:w="60"/>
-              <w:left w:type="dxa" w:w="100"/>
-              <w:bottom w:type="dxa" w:w="60"/>
-              <w:right w:type="dxa" w:w="100"/>
-            </w:tcMar>
-          </w:tcPr>
-          <w:p>
-            <w:pPr>
-              <w:jc w:val="left"/>
-            </w:pPr>
-            <w:r>
-              <w:rPr>
-                <w:b w:val="false"/>
-                <w:bCs w:val="false"/>
-                <w:color w:val="333333"/>
-                <w:sz w:val="20"/>
-                <w:szCs w:val="20"/>
-              </w:rPr>
-              <w:t xml:space="preserve">Prix des matières</w:t>
-            </w:r>
-          </w:p>
-        </w:tc>
-        <w:tc>
-          <w:tcPr>
-            <w:tcW w:type="dxa" w:w="4652"/>
-            <w:tcBorders>
-              <w:top w:val="single" w:color="D9D9D9" w:sz="4"/>
-              <w:left w:val="single" w:color="D9D9D9" w:sz="4"/>
-              <w:bottom w:val="single" w:color="D9D9D9" w:sz="4"/>
-              <w:right w:val="single" w:color="D9D9D9" w:sz="4"/>
-            </w:tcBorders>
-            <w:shd w:fill="FFFFFF" w:color="auto" w:val="clear"/>
-            <w:tcMar>
-              <w:top w:type="dxa" w:w="60"/>
-              <w:left w:type="dxa" w:w="100"/>
-              <w:bottom w:type="dxa" w:w="60"/>
-              <w:right w:type="dxa" w:w="100"/>
-            </w:tcMar>
-          </w:tcPr>
-          <w:p>
-            <w:pPr>
-              <w:jc w:val="left"/>
-            </w:pPr>
-            <w:r>
-              <w:rPr>
-                <w:b w:val="false"/>
-                <w:bCs w:val="false"/>
-                <w:color w:val="333333"/>
-                <w:sz w:val="20"/>
-                <w:szCs w:val="20"/>
-              </w:rPr>
-              <w:t xml:space="preserve">Prix du cuivre − 25 %, coûts + 8 %</w:t>
+              <w:t xml:space="preserve">Immobilier de rendement</w:t>
+            </w:r>
+          </w:p>
+        </w:tc>
+        <w:tc>
+          <w:tcPr>
+            <w:tcW w:type="dxa" w:w="2855"/>
+            <w:tcBorders>
+              <w:top w:val="single" w:color="D9D9D9" w:sz="4"/>
+              <w:left w:val="single" w:color="D9D9D9" w:sz="4"/>
+              <w:bottom w:val="single" w:color="D9D9D9" w:sz="4"/>
+              <w:right w:val="single" w:color="D9D9D9" w:sz="4"/>
+            </w:tcBorders>
+            <w:shd w:fill="FFFFFF" w:color="auto" w:val="clear"/>
+            <w:tcMar>
+              <w:top w:type="dxa" w:w="60"/>
+              <w:left w:type="dxa" w:w="100"/>
+              <w:bottom w:type="dxa" w:w="60"/>
+              <w:right w:type="dxa" w:w="100"/>
+            </w:tcMar>
+          </w:tcPr>
+          <w:p>
+            <w:pPr>
+              <w:jc w:val="left"/>
+            </w:pPr>
+            <w:r>
+              <w:rPr>
+                <w:b w:val="false"/>
+                <w:bCs w:val="false"/>
+                <w:color w:val="333333"/>
+                <w:sz w:val="20"/>
+                <w:szCs w:val="20"/>
+              </w:rPr>
+              <w:t xml:space="preserve">Recettes − 15 %, charges + 5 %</w:t>
+            </w:r>
+          </w:p>
+        </w:tc>
+        <w:tc>
+          <w:tcPr>
+            <w:tcW w:type="dxa" w:w="4442"/>
+            <w:tcBorders>
+              <w:top w:val="single" w:color="D9D9D9" w:sz="4"/>
+              <w:left w:val="single" w:color="D9D9D9" w:sz="4"/>
+              <w:bottom w:val="single" w:color="D9D9D9" w:sz="4"/>
+              <w:right w:val="single" w:color="D9D9D9" w:sz="4"/>
+            </w:tcBorders>
+            <w:shd w:fill="FFFFFF" w:color="auto" w:val="clear"/>
+            <w:tcMar>
+              <w:top w:type="dxa" w:w="60"/>
+              <w:left w:type="dxa" w:w="100"/>
+              <w:bottom w:type="dxa" w:w="60"/>
+              <w:right w:type="dxa" w:w="100"/>
+            </w:tcMar>
+          </w:tcPr>
+          <w:p>
+            <w:pPr>
+              <w:jc w:val="left"/>
+            </w:pPr>
+            <w:r>
+              <w:rPr>
+                <w:b w:val="false"/>
+                <w:bCs w:val="false"/>
+                <w:color w:val="333333"/>
+                <w:sz w:val="20"/>
+                <w:szCs w:val="20"/>
+              </w:rPr>
+              <w:t xml:space="preserve">Historique de vacance du marché ; échéancier des baux</w:t>
             </w:r>
           </w:p>
         </w:tc>
       </w:tr>
       <w:tr>
-        <w:tc>
-          <w:tcPr>
-            <w:tcW w:type="dxa" w:w="2327"/>
+        <w:trPr>
+          <w:cantSplit/>
+        </w:trPr>
+        <w:tc>
+          <w:tcPr>
+            <w:tcW w:type="dxa" w:w="2009"/>
             <w:tcBorders>
               <w:top w:val="single" w:color="D9D9D9" w:sz="4"/>
               <w:left w:val="single" w:color="D9D9D9" w:sz="4"/>
@@ -4413,73 +4782,385 @@
                 <w:sz w:val="20"/>
                 <w:szCs w:val="20"/>
               </w:rPr>
-              <w:t xml:space="preserve">Santé en PPP</w:t>
-            </w:r>
-          </w:p>
-        </w:tc>
-        <w:tc>
-          <w:tcPr>
-            <w:tcW w:type="dxa" w:w="2327"/>
-            <w:tcBorders>
-              <w:top w:val="single" w:color="D9D9D9" w:sz="4"/>
-              <w:left w:val="single" w:color="D9D9D9" w:sz="4"/>
-              <w:bottom w:val="single" w:color="D9D9D9" w:sz="4"/>
-              <w:right w:val="single" w:color="D9D9D9" w:sz="4"/>
-            </w:tcBorders>
-            <w:shd w:fill="FFFFFF" w:color="auto" w:val="clear"/>
-            <w:tcMar>
-              <w:top w:type="dxa" w:w="60"/>
-              <w:left w:type="dxa" w:w="100"/>
-              <w:bottom w:type="dxa" w:w="60"/>
-              <w:right w:type="dxa" w:w="100"/>
-            </w:tcMar>
-          </w:tcPr>
-          <w:p>
-            <w:pPr>
-              <w:jc w:val="left"/>
-            </w:pPr>
-            <w:r>
-              <w:rPr>
-                <w:b w:val="false"/>
-                <w:bCs w:val="false"/>
-                <w:color w:val="333333"/>
-                <w:sz w:val="20"/>
-                <w:szCs w:val="20"/>
-              </w:rPr>
-              <w:t xml:space="preserve">Performance</w:t>
-            </w:r>
-          </w:p>
-        </w:tc>
-        <w:tc>
-          <w:tcPr>
-            <w:tcW w:type="dxa" w:w="4652"/>
-            <w:tcBorders>
-              <w:top w:val="single" w:color="D9D9D9" w:sz="4"/>
-              <w:left w:val="single" w:color="D9D9D9" w:sz="4"/>
-              <w:bottom w:val="single" w:color="D9D9D9" w:sz="4"/>
-              <w:right w:val="single" w:color="D9D9D9" w:sz="4"/>
-            </w:tcBorders>
-            <w:shd w:fill="FFFFFF" w:color="auto" w:val="clear"/>
-            <w:tcMar>
-              <w:top w:type="dxa" w:w="60"/>
-              <w:left w:type="dxa" w:w="100"/>
-              <w:bottom w:type="dxa" w:w="60"/>
-              <w:right w:type="dxa" w:w="100"/>
-            </w:tcMar>
-          </w:tcPr>
-          <w:p>
-            <w:pPr>
-              <w:jc w:val="left"/>
-            </w:pPr>
-            <w:r>
-              <w:rPr>
-                <w:b w:val="false"/>
-                <w:bCs w:val="false"/>
-                <w:color w:val="333333"/>
-                <w:sz w:val="20"/>
-                <w:szCs w:val="20"/>
-              </w:rPr>
-              <w:t xml:space="preserve">Pénalités de performance au maximum contractuel</w:t>
+              <w:t xml:space="preserve">Industrie</w:t>
+            </w:r>
+          </w:p>
+        </w:tc>
+        <w:tc>
+          <w:tcPr>
+            <w:tcW w:type="dxa" w:w="2855"/>
+            <w:tcBorders>
+              <w:top w:val="single" w:color="D9D9D9" w:sz="4"/>
+              <w:left w:val="single" w:color="D9D9D9" w:sz="4"/>
+              <w:bottom w:val="single" w:color="D9D9D9" w:sz="4"/>
+              <w:right w:val="single" w:color="D9D9D9" w:sz="4"/>
+            </w:tcBorders>
+            <w:shd w:fill="FFFFFF" w:color="auto" w:val="clear"/>
+            <w:tcMar>
+              <w:top w:type="dxa" w:w="60"/>
+              <w:left w:type="dxa" w:w="100"/>
+              <w:bottom w:type="dxa" w:w="60"/>
+              <w:right w:type="dxa" w:w="100"/>
+            </w:tcMar>
+          </w:tcPr>
+          <w:p>
+            <w:pPr>
+              <w:jc w:val="left"/>
+            </w:pPr>
+            <w:r>
+              <w:rPr>
+                <w:b w:val="false"/>
+                <w:bCs w:val="false"/>
+                <w:color w:val="333333"/>
+                <w:sz w:val="20"/>
+                <w:szCs w:val="20"/>
+              </w:rPr>
+              <w:t xml:space="preserve">Volumes − 15 %, charges + 15 %</w:t>
+            </w:r>
+          </w:p>
+        </w:tc>
+        <w:tc>
+          <w:tcPr>
+            <w:tcW w:type="dxa" w:w="4442"/>
+            <w:tcBorders>
+              <w:top w:val="single" w:color="D9D9D9" w:sz="4"/>
+              <w:left w:val="single" w:color="D9D9D9" w:sz="4"/>
+              <w:bottom w:val="single" w:color="D9D9D9" w:sz="4"/>
+              <w:right w:val="single" w:color="D9D9D9" w:sz="4"/>
+            </w:tcBorders>
+            <w:shd w:fill="FFFFFF" w:color="auto" w:val="clear"/>
+            <w:tcMar>
+              <w:top w:type="dxa" w:w="60"/>
+              <w:left w:type="dxa" w:w="100"/>
+              <w:bottom w:type="dxa" w:w="60"/>
+              <w:right w:type="dxa" w:w="100"/>
+            </w:tcMar>
+          </w:tcPr>
+          <w:p>
+            <w:pPr>
+              <w:jc w:val="left"/>
+            </w:pPr>
+            <w:r>
+              <w:rPr>
+                <w:b w:val="false"/>
+                <w:bCs w:val="false"/>
+                <w:color w:val="333333"/>
+                <w:sz w:val="20"/>
+                <w:szCs w:val="20"/>
+              </w:rPr>
+              <w:t xml:space="preserve">Étude de marché ; historique des prix des intrants</w:t>
+            </w:r>
+          </w:p>
+        </w:tc>
+      </w:tr>
+      <w:tr>
+        <w:trPr>
+          <w:cantSplit/>
+        </w:trPr>
+        <w:tc>
+          <w:tcPr>
+            <w:tcW w:type="dxa" w:w="2009"/>
+            <w:tcBorders>
+              <w:top w:val="single" w:color="D9D9D9" w:sz="4"/>
+              <w:left w:val="single" w:color="D9D9D9" w:sz="4"/>
+              <w:bottom w:val="single" w:color="D9D9D9" w:sz="4"/>
+              <w:right w:val="single" w:color="D9D9D9" w:sz="4"/>
+            </w:tcBorders>
+            <w:shd w:fill="FFFFFF" w:color="auto" w:val="clear"/>
+            <w:tcMar>
+              <w:top w:type="dxa" w:w="60"/>
+              <w:left w:type="dxa" w:w="100"/>
+              <w:bottom w:type="dxa" w:w="60"/>
+              <w:right w:type="dxa" w:w="100"/>
+            </w:tcMar>
+          </w:tcPr>
+          <w:p>
+            <w:pPr>
+              <w:jc w:val="left"/>
+            </w:pPr>
+            <w:r>
+              <w:rPr>
+                <w:b/>
+                <w:bCs/>
+                <w:color w:val="333333"/>
+                <w:sz w:val="20"/>
+                <w:szCs w:val="20"/>
+              </w:rPr>
+              <w:t xml:space="preserve">Agro-industrie</w:t>
+            </w:r>
+          </w:p>
+        </w:tc>
+        <w:tc>
+          <w:tcPr>
+            <w:tcW w:type="dxa" w:w="2855"/>
+            <w:tcBorders>
+              <w:top w:val="single" w:color="D9D9D9" w:sz="4"/>
+              <w:left w:val="single" w:color="D9D9D9" w:sz="4"/>
+              <w:bottom w:val="single" w:color="D9D9D9" w:sz="4"/>
+              <w:right w:val="single" w:color="D9D9D9" w:sz="4"/>
+            </w:tcBorders>
+            <w:shd w:fill="FFFFFF" w:color="auto" w:val="clear"/>
+            <w:tcMar>
+              <w:top w:type="dxa" w:w="60"/>
+              <w:left w:type="dxa" w:w="100"/>
+              <w:bottom w:type="dxa" w:w="60"/>
+              <w:right w:type="dxa" w:w="100"/>
+            </w:tcMar>
+          </w:tcPr>
+          <w:p>
+            <w:pPr>
+              <w:jc w:val="left"/>
+            </w:pPr>
+            <w:r>
+              <w:rPr>
+                <w:b w:val="false"/>
+                <w:bCs w:val="false"/>
+                <w:color w:val="333333"/>
+                <w:sz w:val="20"/>
+                <w:szCs w:val="20"/>
+              </w:rPr>
+              <w:t xml:space="preserve">Récolte − 20 %, charges + 5 %</w:t>
+            </w:r>
+          </w:p>
+        </w:tc>
+        <w:tc>
+          <w:tcPr>
+            <w:tcW w:type="dxa" w:w="4442"/>
+            <w:tcBorders>
+              <w:top w:val="single" w:color="D9D9D9" w:sz="4"/>
+              <w:left w:val="single" w:color="D9D9D9" w:sz="4"/>
+              <w:bottom w:val="single" w:color="D9D9D9" w:sz="4"/>
+              <w:right w:val="single" w:color="D9D9D9" w:sz="4"/>
+            </w:tcBorders>
+            <w:shd w:fill="FFFFFF" w:color="auto" w:val="clear"/>
+            <w:tcMar>
+              <w:top w:type="dxa" w:w="60"/>
+              <w:left w:type="dxa" w:w="100"/>
+              <w:bottom w:type="dxa" w:w="60"/>
+              <w:right w:type="dxa" w:w="100"/>
+            </w:tcMar>
+          </w:tcPr>
+          <w:p>
+            <w:pPr>
+              <w:jc w:val="left"/>
+            </w:pPr>
+            <w:r>
+              <w:rPr>
+                <w:b w:val="false"/>
+                <w:bCs w:val="false"/>
+                <w:color w:val="333333"/>
+                <w:sz w:val="20"/>
+                <w:szCs w:val="20"/>
+              </w:rPr>
+              <w:t xml:space="preserve">Historique des campagnes (sécheresses)</w:t>
+            </w:r>
+          </w:p>
+        </w:tc>
+      </w:tr>
+      <w:tr>
+        <w:trPr>
+          <w:cantSplit/>
+        </w:trPr>
+        <w:tc>
+          <w:tcPr>
+            <w:tcW w:type="dxa" w:w="2009"/>
+            <w:tcBorders>
+              <w:top w:val="single" w:color="D9D9D9" w:sz="4"/>
+              <w:left w:val="single" w:color="D9D9D9" w:sz="4"/>
+              <w:bottom w:val="single" w:color="D9D9D9" w:sz="4"/>
+              <w:right w:val="single" w:color="D9D9D9" w:sz="4"/>
+            </w:tcBorders>
+            <w:shd w:fill="FFFFFF" w:color="auto" w:val="clear"/>
+            <w:tcMar>
+              <w:top w:type="dxa" w:w="60"/>
+              <w:left w:type="dxa" w:w="100"/>
+              <w:bottom w:type="dxa" w:w="60"/>
+              <w:right w:type="dxa" w:w="100"/>
+            </w:tcMar>
+          </w:tcPr>
+          <w:p>
+            <w:pPr>
+              <w:jc w:val="left"/>
+            </w:pPr>
+            <w:r>
+              <w:rPr>
+                <w:b/>
+                <w:bCs/>
+                <w:color w:val="333333"/>
+                <w:sz w:val="20"/>
+                <w:szCs w:val="20"/>
+              </w:rPr>
+              <w:t xml:space="preserve">Tourisme</w:t>
+            </w:r>
+          </w:p>
+        </w:tc>
+        <w:tc>
+          <w:tcPr>
+            <w:tcW w:type="dxa" w:w="2855"/>
+            <w:tcBorders>
+              <w:top w:val="single" w:color="D9D9D9" w:sz="4"/>
+              <w:left w:val="single" w:color="D9D9D9" w:sz="4"/>
+              <w:bottom w:val="single" w:color="D9D9D9" w:sz="4"/>
+              <w:right w:val="single" w:color="D9D9D9" w:sz="4"/>
+            </w:tcBorders>
+            <w:shd w:fill="FFFFFF" w:color="auto" w:val="clear"/>
+            <w:tcMar>
+              <w:top w:type="dxa" w:w="60"/>
+              <w:left w:type="dxa" w:w="100"/>
+              <w:bottom w:type="dxa" w:w="60"/>
+              <w:right w:type="dxa" w:w="100"/>
+            </w:tcMar>
+          </w:tcPr>
+          <w:p>
+            <w:pPr>
+              <w:jc w:val="left"/>
+            </w:pPr>
+            <w:r>
+              <w:rPr>
+                <w:b w:val="false"/>
+                <w:bCs w:val="false"/>
+                <w:color w:val="333333"/>
+                <w:sz w:val="20"/>
+                <w:szCs w:val="20"/>
+              </w:rPr>
+              <w:t xml:space="preserve">Recettes − 15 %, charges + 5 %</w:t>
+            </w:r>
+          </w:p>
+        </w:tc>
+        <w:tc>
+          <w:tcPr>
+            <w:tcW w:type="dxa" w:w="4442"/>
+            <w:tcBorders>
+              <w:top w:val="single" w:color="D9D9D9" w:sz="4"/>
+              <w:left w:val="single" w:color="D9D9D9" w:sz="4"/>
+              <w:bottom w:val="single" w:color="D9D9D9" w:sz="4"/>
+              <w:right w:val="single" w:color="D9D9D9" w:sz="4"/>
+            </w:tcBorders>
+            <w:shd w:fill="FFFFFF" w:color="auto" w:val="clear"/>
+            <w:tcMar>
+              <w:top w:type="dxa" w:w="60"/>
+              <w:left w:type="dxa" w:w="100"/>
+              <w:bottom w:type="dxa" w:w="60"/>
+              <w:right w:type="dxa" w:w="100"/>
+            </w:tcMar>
+          </w:tcPr>
+          <w:p>
+            <w:pPr>
+              <w:jc w:val="left"/>
+            </w:pPr>
+            <w:r>
+              <w:rPr>
+                <w:b w:val="false"/>
+                <w:bCs w:val="false"/>
+                <w:color w:val="333333"/>
+                <w:sz w:val="20"/>
+                <w:szCs w:val="20"/>
+              </w:rPr>
+              <w:t xml:space="preserve">Historique des crises (2008, 2011, 2020)</w:t>
+            </w:r>
+          </w:p>
+        </w:tc>
+      </w:tr>
+      <w:tr>
+        <w:trPr>
+          <w:cantSplit/>
+        </w:trPr>
+        <w:tc>
+          <w:tcPr>
+            <w:tcW w:type="dxa" w:w="2009"/>
+            <w:tcBorders>
+              <w:top w:val="single" w:color="D9D9D9" w:sz="4"/>
+              <w:left w:val="single" w:color="D9D9D9" w:sz="4"/>
+              <w:bottom w:val="single" w:color="D9D9D9" w:sz="4"/>
+              <w:right w:val="single" w:color="D9D9D9" w:sz="4"/>
+            </w:tcBorders>
+            <w:shd w:fill="FFFFFF" w:color="auto" w:val="clear"/>
+            <w:tcMar>
+              <w:top w:type="dxa" w:w="60"/>
+              <w:left w:type="dxa" w:w="100"/>
+              <w:bottom w:type="dxa" w:w="60"/>
+              <w:right w:type="dxa" w:w="100"/>
+            </w:tcMar>
+          </w:tcPr>
+          <w:p>
+            <w:pPr>
+              <w:jc w:val="left"/>
+            </w:pPr>
+            <w:r>
+              <w:rPr>
+                <w:b/>
+                <w:bCs/>
+                <w:color w:val="333333"/>
+                <w:sz w:val="20"/>
+                <w:szCs w:val="20"/>
+              </w:rPr>
+              <w:t xml:space="preserve">Mines</w:t>
+            </w:r>
+          </w:p>
+        </w:tc>
+        <w:tc>
+          <w:tcPr>
+            <w:tcW w:type="dxa" w:w="2855"/>
+            <w:tcBorders>
+              <w:top w:val="single" w:color="D9D9D9" w:sz="4"/>
+              <w:left w:val="single" w:color="D9D9D9" w:sz="4"/>
+              <w:bottom w:val="single" w:color="D9D9D9" w:sz="4"/>
+              <w:right w:val="single" w:color="D9D9D9" w:sz="4"/>
+            </w:tcBorders>
+            <w:shd w:fill="FFFFFF" w:color="auto" w:val="clear"/>
+            <w:tcMar>
+              <w:top w:type="dxa" w:w="60"/>
+              <w:left w:type="dxa" w:w="100"/>
+              <w:bottom w:type="dxa" w:w="60"/>
+              <w:right w:type="dxa" w:w="100"/>
+            </w:tcMar>
+          </w:tcPr>
+          <w:p>
+            <w:pPr>
+              <w:jc w:val="left"/>
+            </w:pPr>
+            <w:r>
+              <w:rPr>
+                <w:b w:val="false"/>
+                <w:bCs w:val="false"/>
+                <w:color w:val="333333"/>
+                <w:sz w:val="20"/>
+                <w:szCs w:val="20"/>
+              </w:rPr>
+              <w:t xml:space="preserve">Prix − 25 %, coûts + 8 %</w:t>
+            </w:r>
+          </w:p>
+        </w:tc>
+        <w:tc>
+          <w:tcPr>
+            <w:tcW w:type="dxa" w:w="4442"/>
+            <w:tcBorders>
+              <w:top w:val="single" w:color="D9D9D9" w:sz="4"/>
+              <w:left w:val="single" w:color="D9D9D9" w:sz="4"/>
+              <w:bottom w:val="single" w:color="D9D9D9" w:sz="4"/>
+              <w:right w:val="single" w:color="D9D9D9" w:sz="4"/>
+            </w:tcBorders>
+            <w:shd w:fill="FFFFFF" w:color="auto" w:val="clear"/>
+            <w:tcMar>
+              <w:top w:type="dxa" w:w="60"/>
+              <w:left w:type="dxa" w:w="100"/>
+              <w:bottom w:type="dxa" w:w="60"/>
+              <w:right w:type="dxa" w:w="100"/>
+            </w:tcMar>
+          </w:tcPr>
+          <w:p>
+            <w:pPr>
+              <w:jc w:val="left"/>
+            </w:pPr>
+            <w:r>
+              <w:rPr>
+                <w:b w:val="false"/>
+                <w:bCs w:val="false"/>
+                <w:color w:val="333333"/>
+                <w:sz w:val="20"/>
+                <w:szCs w:val="20"/>
+              </w:rPr>
+              <w:t xml:space="preserve">Prix bas sur 10 à 20 ans ; cas bas des analystes</w:t>
             </w:r>
           </w:p>
         </w:tc>
@@ -4495,7 +5176,7 @@
         <w:pStyle w:val="Heading1"/>
       </w:pPr>
       <w:r>
-        <w:t xml:space="preserve">7. Un complément de lecture : le point mort</w:t>
+        <w:t xml:space="preserve">8. Un complément de lecture : le point mort</w:t>
       </w:r>
     </w:p>
     <w:p>
@@ -4556,7 +5237,7 @@
         <w:pStyle w:val="Heading1"/>
       </w:pPr>
       <w:r>
-        <w:t xml:space="preserve">8. Questions fréquentes</w:t>
+        <w:t xml:space="preserve">9. Questions fréquentes</w:t>
       </w:r>
     </w:p>
     <w:p>
@@ -4650,7 +5331,7 @@
         <w:spacing w:after="70" w:line="290"/>
       </w:pPr>
       <w:r>
-        <w:t xml:space="preserve">Il se résume à un DSCR recalculé avec un CFADS dégradé, dont on retient le minimum (indicateur N2).</w:t>
+        <w:t xml:space="preserve">Les hypothèses viennent d’études, de l’historique et des contrats ; l’outil propose une référence par secteur.</w:t>
       </w:r>
     </w:p>
     <w:p>
@@ -4663,7 +5344,7 @@
         <w:spacing w:after="70" w:line="290"/>
       </w:pPr>
       <w:r>
-        <w:t xml:space="preserve">La baisse du CFADS est en général plus forte que celle des recettes, à cause des charges fixes.</w:t>
+        <w:t xml:space="preserve">Le choc se calcule : (recettes perdues + charges supplémentaires) ÷ CFADS central. Il est en général plus fort que la baisse des recettes, à cause des charges fixes.</w:t>
       </w:r>
     </w:p>
     <w:p>
@@ -4676,7 +5357,7 @@
         <w:spacing w:after="70" w:line="290"/>
       </w:pPr>
       <w:r>
-        <w:t xml:space="preserve">N2 influence modérément le score ; sous 1,00x, le plafond C3 limite la note à 4.</w:t>
+        <w:t xml:space="preserve">Le DSCR stressé baisse du même pourcentage que le CFADS ; on retient son minimum (indicateur N2).</w:t>
       </w:r>
     </w:p>
     <w:p>
@@ -4689,7 +5370,7 @@
         <w:spacing w:after="70" w:line="290"/>
       </w:pPr>
       <w:r>
-        <w:t xml:space="preserve">Le résultat dépend du scénario : il doit viser le vrai risque du projet, être sévère mais plausible, et documenté.</w:t>
+        <w:t xml:space="preserve">N2 influence modérément le score ; sous 1,00x, le plafond C3 limite la note à 4.</w:t>
       </w:r>
     </w:p>
     <w:p>
@@ -4704,11 +5385,11 @@
           <w:sz w:val="19"/>
           <w:szCs w:val="19"/>
         </w:rPr>
-        <w:t xml:space="preserve">Les paramètres cités (seuils, poids, plafonds) sont les paramètres candidats du modèle, à valider par le comité de validation. Les cas cités sont fictifs.</w:t>
+        <w:t xml:space="preserve">Les paramètres cités (seuils, poids, plafonds, scénarios de référence) sont des valeurs candidates du modèle, à valider par le comité de validation. Les cas cités sont fictifs.</w:t>
       </w:r>
     </w:p>
     <w:sectPr>
-      <w:footerReference w:type="default" r:id="rId7"/>
+      <w:footerReference w:type="default" r:id="rId6"/>
       <w:pgSz w:w="11906" w:h="16838" w:orient="portrait"/>
       <w:pgMar w:top="1300" w:right="1300" w:bottom="1300" w:left="1300" w:header="708" w:footer="708" w:gutter="0"/>
       <w:pgNumType/>
@@ -4716,10 +5397,6 @@
     </w:sectPr>
   </w:body>
 </w:document>
-</file>
-
-<file path=word/comments.xml><?xml version="1.0" encoding="utf-8"?>
-<w:comments xmlns:cx="http://schemas.microsoft.com/office/drawing/2014/chartex" xmlns:cx1="http://schemas.microsoft.com/office/drawing/2015/9/8/chartex" xmlns:cx2="http://schemas.microsoft.com/office/drawing/2015/10/21/chartex" xmlns:cx3="http://schemas.microsoft.com/office/drawing/2016/5/9/chartex" xmlns:cx4="http://schemas.microsoft.com/office/drawing/2016/5/10/chartex" xmlns:cx5="http://schemas.microsoft.com/office/drawing/2016/5/11/chartex" xmlns:cx6="http://schemas.microsoft.com/office/drawing/2016/5/12/chartex" xmlns:cx7="http://schemas.microsoft.com/office/drawing/2016/5/13/chartex" xmlns:cx8="http://schemas.microsoft.com/office/drawing/2016/5/14/chartex" xmlns:mc="http://schemas.openxmlformats.org/markup-compatibility/2006" xmlns:aink="http://schemas.microsoft.com/office/drawing/2016/ink" xmlns:am3d="http://schemas.microsoft.com/office/drawing/2017/model3d" xmlns:o="urn:schemas-microsoft-com:office:office" xmlns:r="http://schemas.openxmlformats.org/officeDocument/2006/relationships" xmlns:m="http://schemas.openxmlformats.org/officeDocument/2006/math" xmlns:v="urn:schemas-microsoft-com:vml" xmlns:wp14="http://schemas.microsoft.com/office/word/2010/wordprocessingDrawing" xmlns:wp="http://schemas.openxmlformats.org/drawingml/2006/wordprocessingDrawing" xmlns:w10="urn:schemas-microsoft-com:office:word" xmlns:w="http://schemas.openxmlformats.org/wordprocessingml/2006/main" xmlns:w14="http://schemas.microsoft.com/office/word/2010/wordml" xmlns:w15="http://schemas.microsoft.com/office/word/2012/wordml" xmlns:w16cex="http://schemas.microsoft.com/office/word/2018/wordml/cex" xmlns:w16cid="http://schemas.microsoft.com/office/word/2016/wordml/cid" xmlns:w16="http://schemas.microsoft.com/office/word/2018/wordml" xmlns:w16sdtdh="http://schemas.microsoft.com/office/word/2020/wordml/sdtdatahash" xmlns:w16se="http://schemas.microsoft.com/office/word/2015/wordml/symex" xmlns:wpg="http://schemas.microsoft.com/office/word/2010/wordprocessingGroup" xmlns:wpi="http://schemas.microsoft.com/office/word/2010/wordprocessingInk" xmlns:wne="http://schemas.microsoft.com/office/word/2006/wordml" xmlns:wps="http://schemas.microsoft.com/office/word/2010/wordprocessingShape"/>
 </file>
 
 <file path=word/endnotes.xml><?xml version="1.0" encoding="utf-8"?>
@@ -4780,8 +5457,29 @@
         <w:szCs w:val="18"/>
       </w:rPr>
       <w:fldChar w:fldCharType="begin"/>
+    </w:r>
+    <w:r>
+      <w:rPr>
+        <w:color w:val="7A7A7A"/>
+        <w:sz w:val="18"/>
+        <w:szCs w:val="18"/>
+      </w:rPr>
       <w:instrText xml:space="preserve">PAGE</w:instrText>
+    </w:r>
+    <w:r>
+      <w:rPr>
+        <w:color w:val="7A7A7A"/>
+        <w:sz w:val="18"/>
+        <w:szCs w:val="18"/>
+      </w:rPr>
       <w:fldChar w:fldCharType="separate"/>
+    </w:r>
+    <w:r>
+      <w:rPr>
+        <w:color w:val="7A7A7A"/>
+        <w:sz w:val="18"/>
+        <w:szCs w:val="18"/>
+      </w:rPr>
       <w:fldChar w:fldCharType="end"/>
     </w:r>
   </w:p>
@@ -4829,7 +5527,7 @@
 <w:numbering xmlns:wpc="http://schemas.microsoft.com/office/word/2010/wordprocessingCanvas" xmlns:mc="http://schemas.openxmlformats.org/markup-compatibility/2006" xmlns:o="urn:schemas-microsoft-com:office:office" xmlns:r="http://schemas.openxmlformats.org/officeDocument/2006/relationships" xmlns:m="http://schemas.openxmlformats.org/officeDocument/2006/math" xmlns:v="urn:schemas-microsoft-com:vml" xmlns:wp14="http://schemas.microsoft.com/office/word/2010/wordprocessingDrawing" xmlns:wp="http://schemas.openxmlformats.org/drawingml/2006/wordprocessingDrawing" xmlns:w10="urn:schemas-microsoft-com:office:word" xmlns:w="http://schemas.openxmlformats.org/wordprocessingml/2006/main" xmlns:w14="http://schemas.microsoft.com/office/word/2010/wordml" xmlns:w15="http://schemas.microsoft.com/office/word/2012/wordml" xmlns:wpg="http://schemas.microsoft.com/office/word/2010/wordprocessingGroup" xmlns:wpi="http://schemas.microsoft.com/office/word/2010/wordprocessingInk" xmlns:wne="http://schemas.microsoft.com/office/word/2006/wordml" xmlns:wps="http://schemas.microsoft.com/office/word/2010/wordprocessingShape" mc:Ignorable="w14 w15 wp14">
   <w:abstractNum w:abstractNumId="1" w15:restartNumberingAfterBreak="0">
     <w:multiLevelType w:val="hybridMultilevel"/>
-    <w:lvl w:ilvl="0" w15:tentative="1">
+    <w:lvl w:ilvl="0" w:tentative="1">
       <w:start w:val="1"/>
       <w:numFmt w:val="bullet"/>
       <w:lvlText w:val="●"/>
@@ -4838,7 +5536,7 @@
         <w:ind w:left="720" w:hanging="360"/>
       </w:pPr>
     </w:lvl>
-    <w:lvl w:ilvl="1" w15:tentative="1">
+    <w:lvl w:ilvl="1" w:tentative="1">
       <w:start w:val="1"/>
       <w:numFmt w:val="bullet"/>
       <w:lvlText w:val="○"/>
@@ -4847,7 +5545,7 @@
         <w:ind w:left="1440" w:hanging="360"/>
       </w:pPr>
     </w:lvl>
-    <w:lvl w:ilvl="2" w15:tentative="1">
+    <w:lvl w:ilvl="2" w:tentative="1">
       <w:start w:val="1"/>
       <w:numFmt w:val="bullet"/>
       <w:lvlText w:val="■"/>
@@ -4856,7 +5554,7 @@
         <w:ind w:left="2160" w:hanging="360"/>
       </w:pPr>
     </w:lvl>
-    <w:lvl w:ilvl="3" w15:tentative="1">
+    <w:lvl w:ilvl="3" w:tentative="1">
       <w:start w:val="1"/>
       <w:numFmt w:val="bullet"/>
       <w:lvlText w:val="●"/>
@@ -4865,7 +5563,7 @@
         <w:ind w:left="2880" w:hanging="360"/>
       </w:pPr>
     </w:lvl>
-    <w:lvl w:ilvl="4" w15:tentative="1">
+    <w:lvl w:ilvl="4" w:tentative="1">
       <w:start w:val="1"/>
       <w:numFmt w:val="bullet"/>
       <w:lvlText w:val="○"/>
@@ -4874,7 +5572,7 @@
         <w:ind w:left="3600" w:hanging="360"/>
       </w:pPr>
     </w:lvl>
-    <w:lvl w:ilvl="5" w15:tentative="1">
+    <w:lvl w:ilvl="5" w:tentative="1">
       <w:start w:val="1"/>
       <w:numFmt w:val="bullet"/>
       <w:lvlText w:val="■"/>
@@ -4883,7 +5581,7 @@
         <w:ind w:left="4320" w:hanging="360"/>
       </w:pPr>
     </w:lvl>
-    <w:lvl w:ilvl="6" w15:tentative="1">
+    <w:lvl w:ilvl="6" w:tentative="1">
       <w:start w:val="1"/>
       <w:numFmt w:val="bullet"/>
       <w:lvlText w:val="●"/>
@@ -4892,7 +5590,7 @@
         <w:ind w:left="5040" w:hanging="360"/>
       </w:pPr>
     </w:lvl>
-    <w:lvl w:ilvl="7" w15:tentative="1">
+    <w:lvl w:ilvl="7" w:tentative="1">
       <w:start w:val="1"/>
       <w:numFmt w:val="bullet"/>
       <w:lvlText w:val="●"/>
@@ -4901,7 +5599,7 @@
         <w:ind w:left="5760" w:hanging="360"/>
       </w:pPr>
     </w:lvl>
-    <w:lvl w:ilvl="8" w15:tentative="1">
+    <w:lvl w:ilvl="8" w:tentative="1">
       <w:start w:val="1"/>
       <w:numFmt w:val="bullet"/>
       <w:lvlText w:val="●"/>
@@ -4913,7 +5611,7 @@
   </w:abstractNum>
   <w:abstractNum w:abstractNumId="2" w15:restartNumberingAfterBreak="0">
     <w:multiLevelType w:val="hybridMultilevel"/>
-    <w:lvl w:ilvl="0" w15:tentative="1">
+    <w:lvl w:ilvl="0" w:tentative="1">
       <w:start w:val="1"/>
       <w:numFmt w:val="bullet"/>
       <w:lvlText w:val="▪"/>
@@ -4928,7 +5626,7 @@
   </w:abstractNum>
   <w:abstractNum w:abstractNumId="3" w15:restartNumberingAfterBreak="0">
     <w:multiLevelType w:val="hybridMultilevel"/>
-    <w:lvl w:ilvl="0" w15:tentative="1">
+    <w:lvl w:ilvl="0" w:tentative="1">
       <w:start w:val="1"/>
       <w:numFmt w:val="decimal"/>
       <w:lvlText w:val="%1."/>
@@ -4961,6 +5659,12 @@
       <w:startOverride w:val="1"/>
     </w:lvlOverride>
   </w:num>
+  <w:num w:numId="4">
+    <w:abstractNumId w:val="3"/>
+    <w:lvlOverride w:ilvl="0">
+      <w:startOverride w:val="1"/>
+    </w:lvlOverride>
+  </w:num>
 </w:numbering>
 </file>
 
@@ -4977,37 +5681,24 @@
     </w:rPrDefault>
     <w:pPrDefault/>
   </w:docDefaults>
-  <w:style w:type="paragraph" w:styleId="Title">
-    <w:name w:val="Title"/>
-    <w:basedOn w:val="Normal"/>
-    <w:next w:val="Normal"/>
+  <w:style w:type="paragraph" w:styleId="Normal" w:default="1">
+    <w:name w:val="Normal"/>
     <w:qFormat/>
-    <w:rPr>
-      <w:sz w:val="56"/>
-      <w:szCs w:val="56"/>
-    </w:rPr>
   </w:style>
-  <w:style w:type="paragraph" w:styleId="Heading1">
-    <w:name w:val="Heading 1"/>
-    <w:basedOn w:val="Normal"/>
-    <w:next w:val="Normal"/>
-    <w:qFormat/>
-    <w:rPr>
-      <w:color w:val="2E74B5"/>
-      <w:sz w:val="32"/>
-      <w:szCs w:val="32"/>
-    </w:rPr>
-  </w:style>
-  <w:style w:type="paragraph" w:styleId="Heading2">
-    <w:name w:val="Heading 2"/>
-    <w:basedOn w:val="Normal"/>
-    <w:next w:val="Normal"/>
-    <w:qFormat/>
-    <w:rPr>
-      <w:color w:val="2E74B5"/>
-      <w:sz w:val="26"/>
-      <w:szCs w:val="26"/>
-    </w:rPr>
+  <w:style w:type="table" w:styleId="TableNormal" w:default="true">
+    <w:name w:val="Normal Table"/>
+    <w:uiPriority w:val="99"/>
+    <w:semiHidden/>
+    <w:unhideWhenUsed/>
+    <w:tblPr>
+      <w:tblInd w:type="dxa" w:w="0"/>
+      <w:tblCellMar>
+        <w:top w:type="dxa" w:w="0"/>
+        <w:left w:type="dxa" w:w="108"/>
+        <w:bottom w:type="dxa" w:w="0"/>
+        <w:right w:type="dxa" w:w="108"/>
+      </w:tblCellMar>
+    </w:tblPr>
   </w:style>
   <w:style w:type="paragraph" w:styleId="Heading3">
     <w:name w:val="Heading 3"/>
@@ -5063,6 +5754,139 @@
     <w:name w:val="List Paragraph"/>
     <w:basedOn w:val="Normal"/>
     <w:qFormat/>
+  </w:style>
+  <w:style w:type="paragraph" w:styleId="Caption">
+    <w:name w:val="caption"/>
+    <w:basedOn w:val="Normal"/>
+    <w:next w:val="Normal"/>
+    <w:uiPriority w:val="35"/>
+    <w:semiHidden/>
+    <w:unhideWhenUsed/>
+    <w:qFormat/>
+    <w:pPr>
+      <w:spacing w:after="200"/>
+    </w:pPr>
+    <w:rPr>
+      <w:i/>
+      <w:iCs/>
+      <w:color w:val="44546A" w:themeColor="dark2"/>
+      <w:sz w:val="18"/>
+      <w:szCs w:val="18"/>
+    </w:rPr>
+  </w:style>
+  <w:style w:type="paragraph" w:styleId="Bibliography">
+    <w:name w:val="Bibliography"/>
+    <w:basedOn w:val="Normal"/>
+    <w:next w:val="Normal"/>
+    <w:uiPriority w:val="37"/>
+    <w:unhideWhenUsed/>
+  </w:style>
+  <w:style w:type="paragraph" w:styleId="TOC1">
+    <w:name w:val="toc 1"/>
+    <w:basedOn w:val="Normal"/>
+    <w:next w:val="Normal"/>
+    <w:uiPriority w:val="39"/>
+    <w:semiHidden/>
+    <w:unhideWhenUsed/>
+    <w:pPr>
+      <w:spacing w:after="100"/>
+    </w:pPr>
+  </w:style>
+  <w:style w:type="paragraph" w:styleId="TOC2">
+    <w:name w:val="toc 2"/>
+    <w:basedOn w:val="Normal"/>
+    <w:next w:val="Normal"/>
+    <w:uiPriority w:val="39"/>
+    <w:semiHidden/>
+    <w:unhideWhenUsed/>
+    <w:pPr>
+      <w:spacing w:after="100"/>
+      <w:ind w:left="220"/>
+    </w:pPr>
+  </w:style>
+  <w:style w:type="paragraph" w:styleId="TOC3">
+    <w:name w:val="toc 3"/>
+    <w:basedOn w:val="Normal"/>
+    <w:next w:val="Normal"/>
+    <w:uiPriority w:val="39"/>
+    <w:semiHidden/>
+    <w:unhideWhenUsed/>
+    <w:pPr>
+      <w:spacing w:after="100"/>
+      <w:ind w:left="440"/>
+    </w:pPr>
+  </w:style>
+  <w:style w:type="paragraph" w:styleId="TOC4">
+    <w:name w:val="toc 4"/>
+    <w:basedOn w:val="Normal"/>
+    <w:next w:val="Normal"/>
+    <w:uiPriority w:val="39"/>
+    <w:semiHidden/>
+    <w:unhideWhenUsed/>
+    <w:pPr>
+      <w:spacing w:after="100"/>
+      <w:ind w:left="660"/>
+    </w:pPr>
+  </w:style>
+  <w:style w:type="paragraph" w:styleId="TOC5">
+    <w:name w:val="toc 5"/>
+    <w:basedOn w:val="Normal"/>
+    <w:next w:val="Normal"/>
+    <w:uiPriority w:val="39"/>
+    <w:semiHidden/>
+    <w:unhideWhenUsed/>
+    <w:pPr>
+      <w:spacing w:after="100"/>
+      <w:ind w:left="880"/>
+    </w:pPr>
+  </w:style>
+  <w:style w:type="paragraph" w:styleId="TOC6">
+    <w:name w:val="toc 6"/>
+    <w:basedOn w:val="Normal"/>
+    <w:next w:val="Normal"/>
+    <w:uiPriority w:val="39"/>
+    <w:semiHidden/>
+    <w:unhideWhenUsed/>
+    <w:pPr>
+      <w:spacing w:after="100"/>
+      <w:ind w:left="1100"/>
+    </w:pPr>
+  </w:style>
+  <w:style w:type="paragraph" w:styleId="TOC7">
+    <w:name w:val="toc 7"/>
+    <w:basedOn w:val="Normal"/>
+    <w:next w:val="Normal"/>
+    <w:uiPriority w:val="39"/>
+    <w:semiHidden/>
+    <w:unhideWhenUsed/>
+    <w:pPr>
+      <w:spacing w:after="100"/>
+      <w:ind w:left="1320"/>
+    </w:pPr>
+  </w:style>
+  <w:style w:type="paragraph" w:styleId="TOC8">
+    <w:name w:val="toc 8"/>
+    <w:basedOn w:val="Normal"/>
+    <w:next w:val="Normal"/>
+    <w:uiPriority w:val="39"/>
+    <w:semiHidden/>
+    <w:unhideWhenUsed/>
+    <w:pPr>
+      <w:spacing w:after="100"/>
+      <w:ind w:left="1540"/>
+    </w:pPr>
+  </w:style>
+  <w:style w:type="paragraph" w:styleId="TOC9">
+    <w:name w:val="toc 9"/>
+    <w:basedOn w:val="Normal"/>
+    <w:next w:val="Normal"/>
+    <w:uiPriority w:val="39"/>
+    <w:semiHidden/>
+    <w:unhideWhenUsed/>
+    <w:pPr>
+      <w:spacing w:after="100"/>
+      <w:ind w:left="1760"/>
+    </w:pPr>
   </w:style>
   <w:style w:type="character" w:styleId="Hyperlink">
     <w:name w:val="Hyperlink"/>
@@ -5148,6 +5972,13 @@
       <w:szCs w:val="20"/>
     </w:rPr>
   </w:style>
+  <w:style w:type="character" w:styleId="LineNumber">
+    <w:name w:val="line number"/>
+    <w:basedOn w:val="DefaultParagraphFont"/>
+    <w:uiPriority w:val="99"/>
+    <w:semiHidden/>
+    <w:unhideWhenUsed/>
+  </w:style>
   <w:style w:type="paragraph" w:styleId="Title">
     <w:name w:val="Title"/>
     <w:basedOn w:val="Normal"/>
@@ -5204,4 +6035,294 @@
     </w:rPr>
   </w:style>
 </w:styles>
+</file>
+
+<file path=word/theme/theme1.xml><?xml version="1.0" encoding="utf-8"?>
+<a:theme xmlns:a="http://schemas.openxmlformats.org/drawingml/2006/main" name="Office Theme">
+  <a:themeElements>
+    <a:clrScheme name="Office">
+      <a:dk1>
+        <a:sysClr val="windowText" lastClr="000000"/>
+      </a:dk1>
+      <a:lt1>
+        <a:sysClr val="window" lastClr="FFFFFF"/>
+      </a:lt1>
+      <a:dk2>
+        <a:srgbClr val="44546A"/>
+      </a:dk2>
+      <a:lt2>
+        <a:srgbClr val="E7E6E6"/>
+      </a:lt2>
+      <a:accent1>
+        <a:srgbClr val="4472C4"/>
+      </a:accent1>
+      <a:accent2>
+        <a:srgbClr val="ED7D31"/>
+      </a:accent2>
+      <a:accent3>
+        <a:srgbClr val="A5A5A5"/>
+      </a:accent3>
+      <a:accent4>
+        <a:srgbClr val="FFC000"/>
+      </a:accent4>
+      <a:accent5>
+        <a:srgbClr val="5B9BD5"/>
+      </a:accent5>
+      <a:accent6>
+        <a:srgbClr val="70AD47"/>
+      </a:accent6>
+      <a:hlink>
+        <a:srgbClr val="0563C1"/>
+      </a:hlink>
+      <a:folHlink>
+        <a:srgbClr val="954F72"/>
+      </a:folHlink>
+    </a:clrScheme>
+    <a:fontScheme name="Office">
+      <a:majorFont>
+        <a:latin typeface="Calibri Light" panose="020F0302020204030204"/>
+        <a:ea typeface=""/>
+        <a:cs typeface=""/>
+        <a:font script="Jpan" typeface="游ゴシック Light"/>
+        <a:font script="Hang" typeface="맑은 고딕"/>
+        <a:font script="Hans" typeface="等线 Light"/>
+        <a:font script="Hant" typeface="新細明體"/>
+        <a:font script="Arab" typeface="Times New Roman"/>
+        <a:font script="Hebr" typeface="Times New Roman"/>
+        <a:font script="Thai" typeface="Angsana New"/>
+        <a:font script="Ethi" typeface="Nyala"/>
+        <a:font script="Beng" typeface="Vrinda"/>
+        <a:font script="Gujr" typeface="Shruti"/>
+        <a:font script="Khmr" typeface="MoolBoran"/>
+        <a:font script="Knda" typeface="Tunga"/>
+        <a:font script="Guru" typeface="Raavi"/>
+        <a:font script="Cans" typeface="Euphemia"/>
+        <a:font script="Cher" typeface="Plantagenet Cherokee"/>
+        <a:font script="Yiii" typeface="Microsoft Yi Baiti"/>
+        <a:font script="Tibt" typeface="Microsoft Himalaya"/>
+        <a:font script="Thaa" typeface="MV Boli"/>
+        <a:font script="Deva" typeface="Mangal"/>
+        <a:font script="Telu" typeface="Gautami"/>
+        <a:font script="Taml" typeface="Latha"/>
+        <a:font script="Syrc" typeface="Estrangelo Edessa"/>
+        <a:font script="Orya" typeface="Kalinga"/>
+        <a:font script="Mlym" typeface="Kartika"/>
+        <a:font script="Laoo" typeface="DokChampa"/>
+        <a:font script="Sinh" typeface="Iskoola Pota"/>
+        <a:font script="Mong" typeface="Mongolian Baiti"/>
+        <a:font script="Viet" typeface="Times New Roman"/>
+        <a:font script="Uigh" typeface="Microsoft Uighur"/>
+        <a:font script="Geor" typeface="Sylfaen"/>
+        <a:font script="Armn" typeface="Arial"/>
+        <a:font script="Bugi" typeface="Leelawadee UI"/>
+        <a:font script="Bopo" typeface="Microsoft JhengHei"/>
+        <a:font script="Java" typeface="Javanese Text"/>
+        <a:font script="Lisu" typeface="Segoe UI"/>
+        <a:font script="Mymr" typeface="Myanmar Text"/>
+        <a:font script="Nkoo" typeface="Ebrima"/>
+        <a:font script="Olck" typeface="Nirmala UI"/>
+        <a:font script="Osma" typeface="Ebrima"/>
+        <a:font script="Phag" typeface="Phagspa"/>
+        <a:font script="Syrn" typeface="Estrangelo Edessa"/>
+        <a:font script="Syrj" typeface="Estrangelo Edessa"/>
+        <a:font script="Syre" typeface="Estrangelo Edessa"/>
+        <a:font script="Sora" typeface="Nirmala UI"/>
+        <a:font script="Tale" typeface="Microsoft Tai Le"/>
+        <a:font script="Talu" typeface="Microsoft New Tai Lue"/>
+        <a:font script="Tfng" typeface="Ebrima"/>
+      </a:majorFont>
+      <a:minorFont>
+        <a:latin typeface="Calibri" panose="020F0502020204030204"/>
+        <a:ea typeface=""/>
+        <a:cs typeface=""/>
+        <a:font script="Jpan" typeface="游明朝"/>
+        <a:font script="Hang" typeface="맑은 고딕"/>
+        <a:font script="Hans" typeface="等线"/>
+        <a:font script="Hant" typeface="新細明體"/>
+        <a:font script="Arab" typeface="Arial"/>
+        <a:font script="Hebr" typeface="Arial"/>
+        <a:font script="Thai" typeface="Cordia New"/>
+        <a:font script="Ethi" typeface="Nyala"/>
+        <a:font script="Beng" typeface="Vrinda"/>
+        <a:font script="Gujr" typeface="Shruti"/>
+        <a:font script="Khmr" typeface="DaunPenh"/>
+        <a:font script="Knda" typeface="Tunga"/>
+        <a:font script="Guru" typeface="Raavi"/>
+        <a:font script="Cans" typeface="Euphemia"/>
+        <a:font script="Cher" typeface="Plantagenet Cherokee"/>
+        <a:font script="Yiii" typeface="Microsoft Yi Baiti"/>
+        <a:font script="Tibt" typeface="Microsoft Himalaya"/>
+        <a:font script="Thaa" typeface="MV Boli"/>
+        <a:font script="Deva" typeface="Mangal"/>
+        <a:font script="Telu" typeface="Gautami"/>
+        <a:font script="Taml" typeface="Latha"/>
+        <a:font script="Syrc" typeface="Estrangelo Edessa"/>
+        <a:font script="Orya" typeface="Kalinga"/>
+        <a:font script="Mlym" typeface="Kartika"/>
+        <a:font script="Laoo" typeface="DokChampa"/>
+        <a:font script="Sinh" typeface="Iskoola Pota"/>
+        <a:font script="Mong" typeface="Mongolian Baiti"/>
+        <a:font script="Viet" typeface="Arial"/>
+        <a:font script="Uigh" typeface="Microsoft Uighur"/>
+        <a:font script="Geor" typeface="Sylfaen"/>
+        <a:font script="Armn" typeface="Arial"/>
+        <a:font script="Bugi" typeface="Leelawadee UI"/>
+        <a:font script="Bopo" typeface="Microsoft JhengHei"/>
+        <a:font script="Java" typeface="Javanese Text"/>
+        <a:font script="Lisu" typeface="Segoe UI"/>
+        <a:font script="Mymr" typeface="Myanmar Text"/>
+        <a:font script="Nkoo" typeface="Ebrima"/>
+        <a:font script="Olck" typeface="Nirmala UI"/>
+        <a:font script="Osma" typeface="Ebrima"/>
+        <a:font script="Phag" typeface="Phagspa"/>
+        <a:font script="Syrn" typeface="Estrangelo Edessa"/>
+        <a:font script="Syrj" typeface="Estrangelo Edessa"/>
+        <a:font script="Syre" typeface="Estrangelo Edessa"/>
+        <a:font script="Sora" typeface="Nirmala UI"/>
+        <a:font script="Tale" typeface="Microsoft Tai Le"/>
+        <a:font script="Talu" typeface="Microsoft New Tai Lue"/>
+        <a:font script="Tfng" typeface="Ebrima"/>
+      </a:minorFont>
+    </a:fontScheme>
+    <a:fmtScheme name="Office">
+      <a:fillStyleLst>
+        <a:solidFill>
+          <a:schemeClr val="phClr"/>
+        </a:solidFill>
+        <a:gradFill rotWithShape="true">
+          <a:gsLst>
+            <a:gs pos="0">
+              <a:schemeClr val="phClr">
+                <a:lumMod val="110000"/>
+                <a:satMod val="105000"/>
+                <a:tint val="67000"/>
+              </a:schemeClr>
+            </a:gs>
+            <a:gs pos="50000">
+              <a:schemeClr val="phClr">
+                <a:lumMod val="105000"/>
+                <a:satMod val="103000"/>
+                <a:tint val="73000"/>
+              </a:schemeClr>
+            </a:gs>
+            <a:gs pos="100000">
+              <a:schemeClr val="phClr">
+                <a:lumMod val="105000"/>
+                <a:satMod val="109000"/>
+                <a:tint val="81000"/>
+              </a:schemeClr>
+            </a:gs>
+          </a:gsLst>
+          <a:lin ang="5400000" scaled="false"/>
+        </a:gradFill>
+        <a:gradFill rotWithShape="true">
+          <a:gsLst>
+            <a:gs pos="0">
+              <a:schemeClr val="phClr">
+                <a:satMod val="103000"/>
+                <a:lumMod val="102000"/>
+                <a:tint val="94000"/>
+              </a:schemeClr>
+            </a:gs>
+            <a:gs pos="50000">
+              <a:schemeClr val="phClr">
+                <a:satMod val="110000"/>
+                <a:lumMod val="100000"/>
+                <a:shade val="100000"/>
+              </a:schemeClr>
+            </a:gs>
+            <a:gs pos="100000">
+              <a:schemeClr val="phClr">
+                <a:lumMod val="99000"/>
+                <a:satMod val="120000"/>
+                <a:shade val="78000"/>
+              </a:schemeClr>
+            </a:gs>
+          </a:gsLst>
+          <a:lin ang="5400000" scaled="false"/>
+        </a:gradFill>
+      </a:fillStyleLst>
+      <a:lnStyleLst>
+        <a:ln w="6350" cap="flat" cmpd="sng" algn="ctr">
+          <a:solidFill>
+            <a:schemeClr val="phClr"/>
+          </a:solidFill>
+          <a:prstDash val="solid"/>
+          <a:miter lim="800000"/>
+        </a:ln>
+        <a:ln w="12700" cap="flat" cmpd="sng" algn="ctr">
+          <a:solidFill>
+            <a:schemeClr val="phClr"/>
+          </a:solidFill>
+          <a:prstDash val="solid"/>
+          <a:miter lim="800000"/>
+        </a:ln>
+        <a:ln w="19050" cap="flat" cmpd="sng" algn="ctr">
+          <a:solidFill>
+            <a:schemeClr val="phClr"/>
+          </a:solidFill>
+          <a:prstDash val="solid"/>
+          <a:miter lim="800000"/>
+        </a:ln>
+      </a:lnStyleLst>
+      <a:effectStyleLst>
+        <a:effectStyle>
+          <a:effectLst/>
+        </a:effectStyle>
+        <a:effectStyle>
+          <a:effectLst/>
+        </a:effectStyle>
+        <a:effectStyle>
+          <a:effectLst>
+            <a:outerShdw blurRad="57150" dist="19050" dir="5400000" algn="ctr" rotWithShape="false">
+              <a:srgbClr val="000000">
+                <a:alpha val="63000"/>
+              </a:srgbClr>
+            </a:outerShdw>
+          </a:effectLst>
+        </a:effectStyle>
+      </a:effectStyleLst>
+      <a:bgFillStyleLst>
+        <a:solidFill>
+          <a:schemeClr val="phClr"/>
+        </a:solidFill>
+        <a:solidFill>
+          <a:schemeClr val="phClr">
+            <a:tint val="95000"/>
+            <a:satMod val="170000"/>
+          </a:schemeClr>
+        </a:solidFill>
+        <a:gradFill rotWithShape="true">
+          <a:gsLst>
+            <a:gs pos="0">
+              <a:schemeClr val="phClr">
+                <a:tint val="93000"/>
+                <a:satMod val="150000"/>
+                <a:shade val="98000"/>
+                <a:lumMod val="102000"/>
+              </a:schemeClr>
+            </a:gs>
+            <a:gs pos="50000">
+              <a:schemeClr val="phClr">
+                <a:tint val="98000"/>
+                <a:satMod val="130000"/>
+                <a:shade val="90000"/>
+                <a:lumMod val="103000"/>
+              </a:schemeClr>
+            </a:gs>
+            <a:gs pos="100000">
+              <a:schemeClr val="phClr">
+                <a:shade val="63000"/>
+                <a:satMod val="120000"/>
+              </a:schemeClr>
+            </a:gs>
+          </a:gsLst>
+          <a:lin ang="5400000" scaled="false"/>
+        </a:gradFill>
+      </a:bgFillStyleLst>
+    </a:fmtScheme>
+  </a:themeElements>
+  <a:objectDefaults/>
+  <a:extraClrSchemeLst/>
+</a:theme>
 </file>
</xml_diff>